<commit_message>
Added tests to  Chain_API.docx.
</commit_message>
<xml_diff>
--- a/Portal_Database_Design/Chain_APIs.docx
+++ b/Portal_Database_Design/Chain_APIs.docx
@@ -16,17 +16,17 @@
         </w:tblCellMar>
       </w:tblPr>
       <w:tblGrid>
-        <w:gridCol w:w="1927"/>
-        <w:gridCol w:w="1928"/>
-        <w:gridCol w:w="1927"/>
-        <w:gridCol w:w="1928"/>
+        <w:gridCol w:w="1925"/>
+        <w:gridCol w:w="1930"/>
+        <w:gridCol w:w="1925"/>
+        <w:gridCol w:w="1930"/>
         <w:gridCol w:w="1928"/>
       </w:tblGrid>
       <w:tr>
         <w:trPr/>
         <w:tc>
           <w:tcPr>
-            <w:tcW w:w="1927" w:type="dxa"/>
+            <w:tcW w:w="1925" w:type="dxa"/>
             <w:tcBorders>
               <w:top w:val="single" w:sz="4" w:space="0" w:color="000000"/>
               <w:start w:val="single" w:sz="4" w:space="0" w:color="000000"/>
@@ -76,7 +76,7 @@
         </w:tc>
         <w:tc>
           <w:tcPr>
-            <w:tcW w:w="1928" w:type="dxa"/>
+            <w:tcW w:w="1930" w:type="dxa"/>
             <w:tcBorders>
               <w:top w:val="single" w:sz="4" w:space="0" w:color="000000"/>
               <w:start w:val="single" w:sz="4" w:space="0" w:color="000000"/>
@@ -126,7 +126,7 @@
         </w:tc>
         <w:tc>
           <w:tcPr>
-            <w:tcW w:w="1927" w:type="dxa"/>
+            <w:tcW w:w="1925" w:type="dxa"/>
             <w:tcBorders>
               <w:top w:val="single" w:sz="4" w:space="0" w:color="000000"/>
               <w:start w:val="single" w:sz="4" w:space="0" w:color="000000"/>
@@ -176,7 +176,7 @@
         </w:tc>
         <w:tc>
           <w:tcPr>
-            <w:tcW w:w="1928" w:type="dxa"/>
+            <w:tcW w:w="1930" w:type="dxa"/>
             <w:tcBorders>
               <w:top w:val="single" w:sz="4" w:space="0" w:color="000000"/>
               <w:start w:val="single" w:sz="4" w:space="0" w:color="000000"/>
@@ -280,7 +280,7 @@
         <w:trPr/>
         <w:tc>
           <w:tcPr>
-            <w:tcW w:w="1927" w:type="dxa"/>
+            <w:tcW w:w="1925" w:type="dxa"/>
             <w:tcBorders>
               <w:start w:val="single" w:sz="4" w:space="0" w:color="000000"/>
               <w:bottom w:val="single" w:sz="4" w:space="0" w:color="000000"/>
@@ -329,7 +329,7 @@
         </w:tc>
         <w:tc>
           <w:tcPr>
-            <w:tcW w:w="1928" w:type="dxa"/>
+            <w:tcW w:w="1930" w:type="dxa"/>
             <w:tcBorders>
               <w:start w:val="single" w:sz="4" w:space="0" w:color="000000"/>
               <w:bottom w:val="single" w:sz="4" w:space="0" w:color="000000"/>
@@ -378,7 +378,7 @@
         </w:tc>
         <w:tc>
           <w:tcPr>
-            <w:tcW w:w="1927" w:type="dxa"/>
+            <w:tcW w:w="1925" w:type="dxa"/>
             <w:tcBorders>
               <w:start w:val="single" w:sz="4" w:space="0" w:color="000000"/>
               <w:bottom w:val="single" w:sz="4" w:space="0" w:color="000000"/>
@@ -427,7 +427,7 @@
         </w:tc>
         <w:tc>
           <w:tcPr>
-            <w:tcW w:w="1928" w:type="dxa"/>
+            <w:tcW w:w="1930" w:type="dxa"/>
             <w:tcBorders>
               <w:start w:val="single" w:sz="4" w:space="0" w:color="000000"/>
               <w:bottom w:val="single" w:sz="4" w:space="0" w:color="000000"/>
@@ -529,7 +529,7 @@
         <w:trPr/>
         <w:tc>
           <w:tcPr>
-            <w:tcW w:w="1927" w:type="dxa"/>
+            <w:tcW w:w="1925" w:type="dxa"/>
             <w:tcBorders>
               <w:start w:val="single" w:sz="4" w:space="0" w:color="000000"/>
               <w:bottom w:val="single" w:sz="4" w:space="0" w:color="000000"/>
@@ -578,7 +578,7 @@
         </w:tc>
         <w:tc>
           <w:tcPr>
-            <w:tcW w:w="1928" w:type="dxa"/>
+            <w:tcW w:w="1930" w:type="dxa"/>
             <w:tcBorders>
               <w:start w:val="single" w:sz="4" w:space="0" w:color="000000"/>
               <w:bottom w:val="single" w:sz="4" w:space="0" w:color="000000"/>
@@ -627,7 +627,7 @@
         </w:tc>
         <w:tc>
           <w:tcPr>
-            <w:tcW w:w="1927" w:type="dxa"/>
+            <w:tcW w:w="1925" w:type="dxa"/>
             <w:tcBorders>
               <w:start w:val="single" w:sz="4" w:space="0" w:color="000000"/>
               <w:bottom w:val="single" w:sz="4" w:space="0" w:color="000000"/>
@@ -676,7 +676,7 @@
         </w:tc>
         <w:tc>
           <w:tcPr>
-            <w:tcW w:w="1928" w:type="dxa"/>
+            <w:tcW w:w="1930" w:type="dxa"/>
             <w:tcBorders>
               <w:start w:val="single" w:sz="4" w:space="0" w:color="000000"/>
               <w:bottom w:val="single" w:sz="4" w:space="0" w:color="000000"/>
@@ -778,7 +778,7 @@
         <w:trPr/>
         <w:tc>
           <w:tcPr>
-            <w:tcW w:w="1927" w:type="dxa"/>
+            <w:tcW w:w="1925" w:type="dxa"/>
             <w:tcBorders>
               <w:start w:val="single" w:sz="4" w:space="0" w:color="000000"/>
               <w:bottom w:val="single" w:sz="4" w:space="0" w:color="000000"/>
@@ -827,7 +827,7 @@
         </w:tc>
         <w:tc>
           <w:tcPr>
-            <w:tcW w:w="1928" w:type="dxa"/>
+            <w:tcW w:w="1930" w:type="dxa"/>
             <w:tcBorders>
               <w:start w:val="single" w:sz="4" w:space="0" w:color="000000"/>
               <w:bottom w:val="single" w:sz="4" w:space="0" w:color="000000"/>
@@ -876,7 +876,7 @@
         </w:tc>
         <w:tc>
           <w:tcPr>
-            <w:tcW w:w="1927" w:type="dxa"/>
+            <w:tcW w:w="1925" w:type="dxa"/>
             <w:tcBorders>
               <w:start w:val="single" w:sz="4" w:space="0" w:color="000000"/>
               <w:bottom w:val="single" w:sz="4" w:space="0" w:color="000000"/>
@@ -925,7 +925,7 @@
         </w:tc>
         <w:tc>
           <w:tcPr>
-            <w:tcW w:w="1928" w:type="dxa"/>
+            <w:tcW w:w="1930" w:type="dxa"/>
             <w:tcBorders>
               <w:start w:val="single" w:sz="4" w:space="0" w:color="000000"/>
               <w:bottom w:val="single" w:sz="4" w:space="0" w:color="000000"/>
@@ -1027,7 +1027,7 @@
         <w:trPr/>
         <w:tc>
           <w:tcPr>
-            <w:tcW w:w="1927" w:type="dxa"/>
+            <w:tcW w:w="1925" w:type="dxa"/>
             <w:tcBorders>
               <w:start w:val="single" w:sz="4" w:space="0" w:color="000000"/>
               <w:bottom w:val="single" w:sz="4" w:space="0" w:color="000000"/>
@@ -1076,7 +1076,7 @@
         </w:tc>
         <w:tc>
           <w:tcPr>
-            <w:tcW w:w="1928" w:type="dxa"/>
+            <w:tcW w:w="1930" w:type="dxa"/>
             <w:tcBorders>
               <w:start w:val="single" w:sz="4" w:space="0" w:color="000000"/>
               <w:bottom w:val="single" w:sz="4" w:space="0" w:color="000000"/>
@@ -1125,7 +1125,7 @@
         </w:tc>
         <w:tc>
           <w:tcPr>
-            <w:tcW w:w="1927" w:type="dxa"/>
+            <w:tcW w:w="1925" w:type="dxa"/>
             <w:tcBorders>
               <w:start w:val="single" w:sz="4" w:space="0" w:color="000000"/>
               <w:bottom w:val="single" w:sz="4" w:space="0" w:color="000000"/>
@@ -1174,7 +1174,7 @@
         </w:tc>
         <w:tc>
           <w:tcPr>
-            <w:tcW w:w="1928" w:type="dxa"/>
+            <w:tcW w:w="1930" w:type="dxa"/>
             <w:tcBorders>
               <w:start w:val="single" w:sz="4" w:space="0" w:color="000000"/>
               <w:bottom w:val="single" w:sz="4" w:space="0" w:color="000000"/>
@@ -1276,7 +1276,7 @@
         <w:trPr/>
         <w:tc>
           <w:tcPr>
-            <w:tcW w:w="1927" w:type="dxa"/>
+            <w:tcW w:w="1925" w:type="dxa"/>
             <w:tcBorders>
               <w:start w:val="single" w:sz="4" w:space="0" w:color="000000"/>
               <w:bottom w:val="single" w:sz="4" w:space="0" w:color="000000"/>
@@ -1325,7 +1325,7 @@
         </w:tc>
         <w:tc>
           <w:tcPr>
-            <w:tcW w:w="1928" w:type="dxa"/>
+            <w:tcW w:w="1930" w:type="dxa"/>
             <w:tcBorders>
               <w:start w:val="single" w:sz="4" w:space="0" w:color="000000"/>
               <w:bottom w:val="single" w:sz="4" w:space="0" w:color="000000"/>
@@ -1374,7 +1374,7 @@
         </w:tc>
         <w:tc>
           <w:tcPr>
-            <w:tcW w:w="1927" w:type="dxa"/>
+            <w:tcW w:w="1925" w:type="dxa"/>
             <w:tcBorders>
               <w:start w:val="single" w:sz="4" w:space="0" w:color="000000"/>
               <w:bottom w:val="single" w:sz="4" w:space="0" w:color="000000"/>
@@ -1423,7 +1423,7 @@
         </w:tc>
         <w:tc>
           <w:tcPr>
-            <w:tcW w:w="1928" w:type="dxa"/>
+            <w:tcW w:w="1930" w:type="dxa"/>
             <w:tcBorders>
               <w:start w:val="single" w:sz="4" w:space="0" w:color="000000"/>
               <w:bottom w:val="single" w:sz="4" w:space="0" w:color="000000"/>
@@ -1532,6 +1532,347 @@
       <w:r>
         <w:rPr/>
       </w:r>
+    </w:p>
+    <w:p>
+      <w:pPr>
+        <w:pStyle w:val="Normal"/>
+        <w:bidi w:val="0"/>
+        <w:jc w:val="start"/>
+        <w:rPr/>
+      </w:pPr>
+      <w:r>
+        <w:rPr/>
+        <w:t>For CreateChain, the following tests:</w:t>
+      </w:r>
+    </w:p>
+    <w:p>
+      <w:pPr>
+        <w:pStyle w:val="Normal"/>
+        <w:bidi w:val="0"/>
+        <w:jc w:val="start"/>
+        <w:rPr/>
+      </w:pPr>
+      <w:r>
+        <w:rPr/>
+        <w:t>* Send an empty request body</w:t>
+      </w:r>
+    </w:p>
+    <w:p>
+      <w:pPr>
+        <w:pStyle w:val="Normal"/>
+        <w:bidi w:val="0"/>
+        <w:jc w:val="start"/>
+        <w:rPr/>
+      </w:pPr>
+      <w:r>
+        <w:rPr/>
+        <w:t>* Create a CHAIN tuple with data in all non-null attributes.</w:t>
+      </w:r>
+    </w:p>
+    <w:p>
+      <w:pPr>
+        <w:pStyle w:val="Normal"/>
+        <w:bidi w:val="0"/>
+        <w:jc w:val="start"/>
+        <w:rPr/>
+      </w:pPr>
+      <w:r>
+        <w:rPr/>
+        <w:t>* Create a CHAIN tuple without the chain_name.</w:t>
+      </w:r>
+    </w:p>
+    <w:p>
+      <w:pPr>
+        <w:pStyle w:val="Normal"/>
+        <w:bidi w:val="0"/>
+        <w:jc w:val="start"/>
+        <w:rPr/>
+      </w:pPr>
+      <w:bookmarkStart w:id="0" w:name="__DdeLink__92_3803631280"/>
+      <w:r>
+        <w:rPr/>
+        <w:t>* Create a CHAIN tuple without the chain_headquarters_address_city.</w:t>
+      </w:r>
+      <w:bookmarkEnd w:id="0"/>
+    </w:p>
+    <w:p>
+      <w:pPr>
+        <w:pStyle w:val="Normal"/>
+        <w:bidi w:val="0"/>
+        <w:jc w:val="start"/>
+        <w:rPr/>
+      </w:pPr>
+      <w:r>
+        <w:rPr/>
+        <w:t>* Create a CHAIN tuple without the chain_headquarters_address_post_code.</w:t>
+      </w:r>
+    </w:p>
+    <w:p>
+      <w:pPr>
+        <w:pStyle w:val="Normal"/>
+        <w:bidi w:val="0"/>
+        <w:jc w:val="start"/>
+        <w:rPr/>
+      </w:pPr>
+      <w:r>
+        <w:rPr/>
+      </w:r>
+    </w:p>
+    <w:p>
+      <w:pPr>
+        <w:pStyle w:val="Normal"/>
+        <w:bidi w:val="0"/>
+        <w:jc w:val="start"/>
+        <w:rPr/>
+      </w:pPr>
+      <w:r>
+        <w:rPr/>
+        <w:t>For UpdateChainName, the following tests:</w:t>
+      </w:r>
+    </w:p>
+    <w:p>
+      <w:pPr>
+        <w:pStyle w:val="Normal"/>
+        <w:bidi w:val="0"/>
+        <w:jc w:val="start"/>
+        <w:rPr/>
+      </w:pPr>
+      <w:r>
+        <w:rPr/>
+        <w:t>* Send an empty request body.</w:t>
+      </w:r>
+    </w:p>
+    <w:p>
+      <w:pPr>
+        <w:pStyle w:val="Normal"/>
+        <w:bidi w:val="0"/>
+        <w:jc w:val="start"/>
+        <w:rPr/>
+      </w:pPr>
+      <w:r>
+        <w:rPr/>
+        <w:t>* Update a CHAIN’s chain_name with 1234.</w:t>
+      </w:r>
+    </w:p>
+    <w:p>
+      <w:pPr>
+        <w:pStyle w:val="Normal"/>
+        <w:bidi w:val="0"/>
+        <w:jc w:val="start"/>
+        <w:rPr/>
+      </w:pPr>
+      <w:r>
+        <w:rPr/>
+        <w:t>* Update a CHAIN’s chain_name with a name containing letters and numbers.</w:t>
+      </w:r>
+    </w:p>
+    <w:p>
+      <w:pPr>
+        <w:pStyle w:val="Normal"/>
+        <w:bidi w:val="0"/>
+        <w:jc w:val="start"/>
+        <w:rPr/>
+      </w:pPr>
+      <w:r>
+        <w:rPr/>
+        <w:t>* Update a CHAIN’s chain_name with a name containing letters only.</w:t>
+      </w:r>
+    </w:p>
+    <w:p>
+      <w:pPr>
+        <w:pStyle w:val="Normal"/>
+        <w:bidi w:val="0"/>
+        <w:jc w:val="start"/>
+        <w:rPr/>
+      </w:pPr>
+      <w:r>
+        <w:rPr/>
+      </w:r>
+    </w:p>
+    <w:p>
+      <w:pPr>
+        <w:pStyle w:val="Normal"/>
+        <w:bidi w:val="0"/>
+        <w:jc w:val="start"/>
+        <w:rPr/>
+      </w:pPr>
+      <w:bookmarkStart w:id="1" w:name="__DdeLink__100_3803631280"/>
+      <w:r>
+        <w:rPr/>
+        <w:t>For UpdateChainAddress, the following tests:</w:t>
+      </w:r>
+      <w:bookmarkEnd w:id="1"/>
+    </w:p>
+    <w:p>
+      <w:pPr>
+        <w:pStyle w:val="Normal"/>
+        <w:bidi w:val="0"/>
+        <w:jc w:val="start"/>
+        <w:rPr/>
+      </w:pPr>
+      <w:r>
+        <w:rPr/>
+        <w:t>* Send an empty request body.</w:t>
+      </w:r>
+    </w:p>
+    <w:p>
+      <w:pPr>
+        <w:pStyle w:val="Normal"/>
+        <w:bidi w:val="0"/>
+        <w:jc w:val="start"/>
+        <w:rPr/>
+      </w:pPr>
+      <w:bookmarkStart w:id="2" w:name="__DdeLink__94_3803631280"/>
+      <w:r>
+        <w:rPr/>
+        <w:t>* Update the CHAIN’s chain_headquarters_address_city.</w:t>
+      </w:r>
+      <w:bookmarkEnd w:id="2"/>
+    </w:p>
+    <w:p>
+      <w:pPr>
+        <w:pStyle w:val="Normal"/>
+        <w:bidi w:val="0"/>
+        <w:jc w:val="start"/>
+        <w:rPr/>
+      </w:pPr>
+      <w:r>
+        <w:rPr/>
+        <w:t xml:space="preserve">* </w:t>
+      </w:r>
+      <w:bookmarkStart w:id="3" w:name="__DdeLink__96_3803631280"/>
+      <w:r>
+        <w:rPr/>
+        <w:t>Update the CHAIN’s chain_headquarters_address_street</w:t>
+      </w:r>
+      <w:bookmarkEnd w:id="3"/>
+      <w:r>
+        <w:rPr/>
+        <w:t>.</w:t>
+      </w:r>
+    </w:p>
+    <w:p>
+      <w:pPr>
+        <w:pStyle w:val="Normal"/>
+        <w:bidi w:val="0"/>
+        <w:jc w:val="start"/>
+        <w:rPr/>
+      </w:pPr>
+      <w:bookmarkStart w:id="4" w:name="__DdeLink__98_3803631280"/>
+      <w:r>
+        <w:rPr/>
+        <w:t>* Update the CHAIN’s chain_headquarters_address_country.</w:t>
+      </w:r>
+      <w:bookmarkEnd w:id="4"/>
+    </w:p>
+    <w:p>
+      <w:pPr>
+        <w:pStyle w:val="Normal"/>
+        <w:bidi w:val="0"/>
+        <w:jc w:val="start"/>
+        <w:rPr/>
+      </w:pPr>
+      <w:r>
+        <w:rPr/>
+        <w:t>* Update the CHAIN’s chain_headquarters_address_admin_division.</w:t>
+      </w:r>
+    </w:p>
+    <w:p>
+      <w:pPr>
+        <w:pStyle w:val="Normal"/>
+        <w:bidi w:val="0"/>
+        <w:jc w:val="start"/>
+        <w:rPr/>
+      </w:pPr>
+      <w:r>
+        <w:rPr/>
+        <w:t>* Update the CHAIN’s chain_headquarters_address_post_code.</w:t>
+      </w:r>
+    </w:p>
+    <w:p>
+      <w:pPr>
+        <w:pStyle w:val="Normal"/>
+        <w:bidi w:val="0"/>
+        <w:jc w:val="start"/>
+        <w:rPr/>
+      </w:pPr>
+      <w:r>
+        <w:rPr/>
+      </w:r>
+    </w:p>
+    <w:p>
+      <w:pPr>
+        <w:pStyle w:val="Normal"/>
+        <w:bidi w:val="0"/>
+        <w:jc w:val="start"/>
+        <w:rPr/>
+      </w:pPr>
+      <w:bookmarkStart w:id="5" w:name="__DdeLink__139_2312781727"/>
+      <w:r>
+        <w:rPr/>
+        <w:t xml:space="preserve">For </w:t>
+      </w:r>
+      <w:r>
+        <w:rPr/>
+        <w:t>remove</w:t>
+      </w:r>
+      <w:r>
+        <w:rPr/>
+        <w:t>Chain, the following tests:</w:t>
+      </w:r>
+    </w:p>
+    <w:p>
+      <w:pPr>
+        <w:pStyle w:val="Normal"/>
+        <w:bidi w:val="0"/>
+        <w:jc w:val="start"/>
+        <w:rPr/>
+      </w:pPr>
+      <w:r>
+        <w:rPr/>
+        <w:t>* Send an empty request body.</w:t>
+      </w:r>
+    </w:p>
+    <w:p>
+      <w:pPr>
+        <w:pStyle w:val="Normal"/>
+        <w:bidi w:val="0"/>
+        <w:jc w:val="start"/>
+        <w:rPr/>
+      </w:pPr>
+      <w:r>
+        <w:rPr/>
+        <w:t xml:space="preserve">* Delete the CHAIN with chain_id </w:t>
+      </w:r>
+      <w:r>
+        <w:rPr/>
+        <w:t>11</w:t>
+      </w:r>
+      <w:r>
+        <w:rPr/>
+        <w:t>.</w:t>
+      </w:r>
+    </w:p>
+    <w:p>
+      <w:pPr>
+        <w:pStyle w:val="Normal"/>
+        <w:bidi w:val="0"/>
+        <w:jc w:val="start"/>
+        <w:rPr/>
+      </w:pPr>
+      <w:r>
+        <w:rPr/>
+        <w:t xml:space="preserve">* Delete the CHAIN with chain_id </w:t>
+      </w:r>
+      <w:r>
+        <w:rPr/>
+        <w:t>12</w:t>
+      </w:r>
+      <w:r>
+        <w:rPr/>
+        <w:t>.</w:t>
+      </w:r>
+      <w:bookmarkEnd w:id="5"/>
     </w:p>
     <w:sectPr>
       <w:type w:val="nextPage"/>
@@ -1540,6 +1881,7 @@
       <w:pgNumType w:fmt="decimal"/>
       <w:formProt w:val="false"/>
       <w:textDirection w:val="lrTb"/>
+      <w:docGrid w:type="default" w:linePitch="100" w:charSpace="0"/>
     </w:sectPr>
   </w:body>
 </w:document>
@@ -1559,7 +1901,6 @@
     </w:rPrDefault>
     <w:pPrDefault>
       <w:pPr>
-        <w:widowControl/>
         <w:suppressAutoHyphens w:val="true"/>
       </w:pPr>
     </w:pPrDefault>
@@ -1569,7 +1910,10 @@
     <w:qFormat/>
     <w:pPr>
       <w:widowControl/>
+      <w:suppressAutoHyphens w:val="true"/>
       <w:bidi w:val="0"/>
+      <w:spacing w:before="0" w:after="0"/>
+      <w:jc w:val="start"/>
     </w:pPr>
     <w:rPr>
       <w:rFonts w:ascii="Liberation Serif" w:hAnsi="Liberation Serif" w:eastAsia="Noto Serif CJK SC" w:cs="Noto Sans Devanagari"/>

</xml_diff>

<commit_message>
Created new integration tests for chains.
</commit_message>
<xml_diff>
--- a/Portal_Database_Design/Chain_APIs.docx
+++ b/Portal_Database_Design/Chain_APIs.docx
@@ -16,17 +16,17 @@
         </w:tblCellMar>
       </w:tblPr>
       <w:tblGrid>
-        <w:gridCol w:w="1925"/>
-        <w:gridCol w:w="1930"/>
-        <w:gridCol w:w="1925"/>
-        <w:gridCol w:w="1930"/>
+        <w:gridCol w:w="1923"/>
+        <w:gridCol w:w="1932"/>
+        <w:gridCol w:w="1923"/>
+        <w:gridCol w:w="1932"/>
         <w:gridCol w:w="1928"/>
       </w:tblGrid>
       <w:tr>
         <w:trPr/>
         <w:tc>
           <w:tcPr>
-            <w:tcW w:w="1925" w:type="dxa"/>
+            <w:tcW w:w="1923" w:type="dxa"/>
             <w:tcBorders>
               <w:top w:val="single" w:sz="4" w:space="0" w:color="000000"/>
               <w:start w:val="single" w:sz="4" w:space="0" w:color="000000"/>
@@ -76,7 +76,7 @@
         </w:tc>
         <w:tc>
           <w:tcPr>
-            <w:tcW w:w="1930" w:type="dxa"/>
+            <w:tcW w:w="1932" w:type="dxa"/>
             <w:tcBorders>
               <w:top w:val="single" w:sz="4" w:space="0" w:color="000000"/>
               <w:start w:val="single" w:sz="4" w:space="0" w:color="000000"/>
@@ -126,7 +126,7 @@
         </w:tc>
         <w:tc>
           <w:tcPr>
-            <w:tcW w:w="1925" w:type="dxa"/>
+            <w:tcW w:w="1923" w:type="dxa"/>
             <w:tcBorders>
               <w:top w:val="single" w:sz="4" w:space="0" w:color="000000"/>
               <w:start w:val="single" w:sz="4" w:space="0" w:color="000000"/>
@@ -176,7 +176,7 @@
         </w:tc>
         <w:tc>
           <w:tcPr>
-            <w:tcW w:w="1930" w:type="dxa"/>
+            <w:tcW w:w="1932" w:type="dxa"/>
             <w:tcBorders>
               <w:top w:val="single" w:sz="4" w:space="0" w:color="000000"/>
               <w:start w:val="single" w:sz="4" w:space="0" w:color="000000"/>
@@ -280,7 +280,7 @@
         <w:trPr/>
         <w:tc>
           <w:tcPr>
-            <w:tcW w:w="1925" w:type="dxa"/>
+            <w:tcW w:w="1923" w:type="dxa"/>
             <w:tcBorders>
               <w:start w:val="single" w:sz="4" w:space="0" w:color="000000"/>
               <w:bottom w:val="single" w:sz="4" w:space="0" w:color="000000"/>
@@ -329,7 +329,7 @@
         </w:tc>
         <w:tc>
           <w:tcPr>
-            <w:tcW w:w="1930" w:type="dxa"/>
+            <w:tcW w:w="1932" w:type="dxa"/>
             <w:tcBorders>
               <w:start w:val="single" w:sz="4" w:space="0" w:color="000000"/>
               <w:bottom w:val="single" w:sz="4" w:space="0" w:color="000000"/>
@@ -378,7 +378,7 @@
         </w:tc>
         <w:tc>
           <w:tcPr>
-            <w:tcW w:w="1925" w:type="dxa"/>
+            <w:tcW w:w="1923" w:type="dxa"/>
             <w:tcBorders>
               <w:start w:val="single" w:sz="4" w:space="0" w:color="000000"/>
               <w:bottom w:val="single" w:sz="4" w:space="0" w:color="000000"/>
@@ -427,7 +427,7 @@
         </w:tc>
         <w:tc>
           <w:tcPr>
-            <w:tcW w:w="1930" w:type="dxa"/>
+            <w:tcW w:w="1932" w:type="dxa"/>
             <w:tcBorders>
               <w:start w:val="single" w:sz="4" w:space="0" w:color="000000"/>
               <w:bottom w:val="single" w:sz="4" w:space="0" w:color="000000"/>
@@ -529,7 +529,7 @@
         <w:trPr/>
         <w:tc>
           <w:tcPr>
-            <w:tcW w:w="1925" w:type="dxa"/>
+            <w:tcW w:w="1923" w:type="dxa"/>
             <w:tcBorders>
               <w:start w:val="single" w:sz="4" w:space="0" w:color="000000"/>
               <w:bottom w:val="single" w:sz="4" w:space="0" w:color="000000"/>
@@ -578,7 +578,7 @@
         </w:tc>
         <w:tc>
           <w:tcPr>
-            <w:tcW w:w="1930" w:type="dxa"/>
+            <w:tcW w:w="1932" w:type="dxa"/>
             <w:tcBorders>
               <w:start w:val="single" w:sz="4" w:space="0" w:color="000000"/>
               <w:bottom w:val="single" w:sz="4" w:space="0" w:color="000000"/>
@@ -627,7 +627,7 @@
         </w:tc>
         <w:tc>
           <w:tcPr>
-            <w:tcW w:w="1925" w:type="dxa"/>
+            <w:tcW w:w="1923" w:type="dxa"/>
             <w:tcBorders>
               <w:start w:val="single" w:sz="4" w:space="0" w:color="000000"/>
               <w:bottom w:val="single" w:sz="4" w:space="0" w:color="000000"/>
@@ -676,7 +676,7 @@
         </w:tc>
         <w:tc>
           <w:tcPr>
-            <w:tcW w:w="1930" w:type="dxa"/>
+            <w:tcW w:w="1932" w:type="dxa"/>
             <w:tcBorders>
               <w:start w:val="single" w:sz="4" w:space="0" w:color="000000"/>
               <w:bottom w:val="single" w:sz="4" w:space="0" w:color="000000"/>
@@ -778,7 +778,7 @@
         <w:trPr/>
         <w:tc>
           <w:tcPr>
-            <w:tcW w:w="1925" w:type="dxa"/>
+            <w:tcW w:w="1923" w:type="dxa"/>
             <w:tcBorders>
               <w:start w:val="single" w:sz="4" w:space="0" w:color="000000"/>
               <w:bottom w:val="single" w:sz="4" w:space="0" w:color="000000"/>
@@ -827,7 +827,7 @@
         </w:tc>
         <w:tc>
           <w:tcPr>
-            <w:tcW w:w="1930" w:type="dxa"/>
+            <w:tcW w:w="1932" w:type="dxa"/>
             <w:tcBorders>
               <w:start w:val="single" w:sz="4" w:space="0" w:color="000000"/>
               <w:bottom w:val="single" w:sz="4" w:space="0" w:color="000000"/>
@@ -876,7 +876,7 @@
         </w:tc>
         <w:tc>
           <w:tcPr>
-            <w:tcW w:w="1925" w:type="dxa"/>
+            <w:tcW w:w="1923" w:type="dxa"/>
             <w:tcBorders>
               <w:start w:val="single" w:sz="4" w:space="0" w:color="000000"/>
               <w:bottom w:val="single" w:sz="4" w:space="0" w:color="000000"/>
@@ -925,7 +925,7 @@
         </w:tc>
         <w:tc>
           <w:tcPr>
-            <w:tcW w:w="1930" w:type="dxa"/>
+            <w:tcW w:w="1932" w:type="dxa"/>
             <w:tcBorders>
               <w:start w:val="single" w:sz="4" w:space="0" w:color="000000"/>
               <w:bottom w:val="single" w:sz="4" w:space="0" w:color="000000"/>
@@ -1027,7 +1027,7 @@
         <w:trPr/>
         <w:tc>
           <w:tcPr>
-            <w:tcW w:w="1925" w:type="dxa"/>
+            <w:tcW w:w="1923" w:type="dxa"/>
             <w:tcBorders>
               <w:start w:val="single" w:sz="4" w:space="0" w:color="000000"/>
               <w:bottom w:val="single" w:sz="4" w:space="0" w:color="000000"/>
@@ -1076,7 +1076,7 @@
         </w:tc>
         <w:tc>
           <w:tcPr>
-            <w:tcW w:w="1930" w:type="dxa"/>
+            <w:tcW w:w="1932" w:type="dxa"/>
             <w:tcBorders>
               <w:start w:val="single" w:sz="4" w:space="0" w:color="000000"/>
               <w:bottom w:val="single" w:sz="4" w:space="0" w:color="000000"/>
@@ -1125,7 +1125,7 @@
         </w:tc>
         <w:tc>
           <w:tcPr>
-            <w:tcW w:w="1925" w:type="dxa"/>
+            <w:tcW w:w="1923" w:type="dxa"/>
             <w:tcBorders>
               <w:start w:val="single" w:sz="4" w:space="0" w:color="000000"/>
               <w:bottom w:val="single" w:sz="4" w:space="0" w:color="000000"/>
@@ -1174,7 +1174,7 @@
         </w:tc>
         <w:tc>
           <w:tcPr>
-            <w:tcW w:w="1930" w:type="dxa"/>
+            <w:tcW w:w="1932" w:type="dxa"/>
             <w:tcBorders>
               <w:start w:val="single" w:sz="4" w:space="0" w:color="000000"/>
               <w:bottom w:val="single" w:sz="4" w:space="0" w:color="000000"/>
@@ -1276,7 +1276,7 @@
         <w:trPr/>
         <w:tc>
           <w:tcPr>
-            <w:tcW w:w="1925" w:type="dxa"/>
+            <w:tcW w:w="1923" w:type="dxa"/>
             <w:tcBorders>
               <w:start w:val="single" w:sz="4" w:space="0" w:color="000000"/>
               <w:bottom w:val="single" w:sz="4" w:space="0" w:color="000000"/>
@@ -1325,7 +1325,7 @@
         </w:tc>
         <w:tc>
           <w:tcPr>
-            <w:tcW w:w="1930" w:type="dxa"/>
+            <w:tcW w:w="1932" w:type="dxa"/>
             <w:tcBorders>
               <w:start w:val="single" w:sz="4" w:space="0" w:color="000000"/>
               <w:bottom w:val="single" w:sz="4" w:space="0" w:color="000000"/>
@@ -1374,7 +1374,7 @@
         </w:tc>
         <w:tc>
           <w:tcPr>
-            <w:tcW w:w="1925" w:type="dxa"/>
+            <w:tcW w:w="1923" w:type="dxa"/>
             <w:tcBorders>
               <w:start w:val="single" w:sz="4" w:space="0" w:color="000000"/>
               <w:bottom w:val="single" w:sz="4" w:space="0" w:color="000000"/>
@@ -1423,7 +1423,7 @@
         </w:tc>
         <w:tc>
           <w:tcPr>
-            <w:tcW w:w="1930" w:type="dxa"/>
+            <w:tcW w:w="1932" w:type="dxa"/>
             <w:tcBorders>
               <w:start w:val="single" w:sz="4" w:space="0" w:color="000000"/>
               <w:bottom w:val="single" w:sz="4" w:space="0" w:color="000000"/>
@@ -1807,72 +1807,52 @@
         <w:jc w:val="start"/>
         <w:rPr/>
       </w:pPr>
+      <w:r>
+        <w:rPr/>
+        <w:t>For removeChain, the following tests:</w:t>
+      </w:r>
+    </w:p>
+    <w:p>
+      <w:pPr>
+        <w:pStyle w:val="Normal"/>
+        <w:bidi w:val="0"/>
+        <w:jc w:val="start"/>
+        <w:rPr/>
+      </w:pPr>
+      <w:r>
+        <w:rPr/>
+        <w:t>* Send an empty request body.</w:t>
+      </w:r>
+    </w:p>
+    <w:p>
+      <w:pPr>
+        <w:pStyle w:val="Normal"/>
+        <w:bidi w:val="0"/>
+        <w:jc w:val="start"/>
+        <w:rPr/>
+      </w:pPr>
+      <w:r>
+        <w:rPr/>
+        <w:t>* Delete the CHAIN with chain_id 11.</w:t>
+      </w:r>
+    </w:p>
+    <w:p>
+      <w:pPr>
+        <w:pStyle w:val="Normal"/>
+        <w:bidi w:val="0"/>
+        <w:jc w:val="start"/>
+        <w:rPr/>
+      </w:pPr>
       <w:bookmarkStart w:id="5" w:name="__DdeLink__139_2312781727"/>
-      <w:r>
-        <w:rPr/>
-        <w:t xml:space="preserve">For </w:t>
-      </w:r>
-      <w:r>
-        <w:rPr/>
-        <w:t>remove</w:t>
-      </w:r>
-      <w:r>
-        <w:rPr/>
-        <w:t>Chain, the following tests:</w:t>
-      </w:r>
-    </w:p>
-    <w:p>
-      <w:pPr>
-        <w:pStyle w:val="Normal"/>
-        <w:bidi w:val="0"/>
-        <w:jc w:val="start"/>
-        <w:rPr/>
-      </w:pPr>
-      <w:r>
-        <w:rPr/>
-        <w:t>* Send an empty request body.</w:t>
-      </w:r>
-    </w:p>
-    <w:p>
-      <w:pPr>
-        <w:pStyle w:val="Normal"/>
-        <w:bidi w:val="0"/>
-        <w:jc w:val="start"/>
-        <w:rPr/>
-      </w:pPr>
-      <w:r>
-        <w:rPr/>
-        <w:t xml:space="preserve">* Delete the CHAIN with chain_id </w:t>
-      </w:r>
-      <w:r>
-        <w:rPr/>
-        <w:t>11</w:t>
-      </w:r>
-      <w:r>
-        <w:rPr/>
-        <w:t>.</w:t>
-      </w:r>
-    </w:p>
-    <w:p>
-      <w:pPr>
-        <w:pStyle w:val="Normal"/>
-        <w:bidi w:val="0"/>
-        <w:jc w:val="start"/>
-        <w:rPr/>
-      </w:pPr>
-      <w:r>
-        <w:rPr/>
-        <w:t xml:space="preserve">* Delete the CHAIN with chain_id </w:t>
-      </w:r>
-      <w:r>
-        <w:rPr/>
-        <w:t>12</w:t>
-      </w:r>
-      <w:r>
-        <w:rPr/>
-        <w:t>.</w:t>
+      <w:bookmarkStart w:id="6" w:name="__DdeLink__142_2312781727"/>
+      <w:bookmarkStart w:id="7" w:name="__DdeLink__296_1992960000"/>
+      <w:r>
+        <w:rPr/>
+        <w:t>* Delete the CHAIN with chain_id 12.</w:t>
       </w:r>
       <w:bookmarkEnd w:id="5"/>
+      <w:bookmarkEnd w:id="6"/>
+      <w:bookmarkEnd w:id="7"/>
     </w:p>
     <w:sectPr>
       <w:type w:val="nextPage"/>
@@ -1911,6 +1891,7 @@
     <w:pPr>
       <w:widowControl/>
       <w:suppressAutoHyphens w:val="true"/>
+      <w:overflowPunct w:val="false"/>
       <w:bidi w:val="0"/>
       <w:spacing w:before="0" w:after="0"/>
       <w:jc w:val="start"/>

</xml_diff>

<commit_message>
Created database test cases for chains.
</commit_message>
<xml_diff>
--- a/Portal_Database_Design/Chain_APIs.docx
+++ b/Portal_Database_Design/Chain_APIs.docx
@@ -16,17 +16,17 @@
         </w:tblCellMar>
       </w:tblPr>
       <w:tblGrid>
-        <w:gridCol w:w="1923"/>
-        <w:gridCol w:w="1932"/>
-        <w:gridCol w:w="1923"/>
-        <w:gridCol w:w="1932"/>
+        <w:gridCol w:w="1921"/>
+        <w:gridCol w:w="1934"/>
+        <w:gridCol w:w="1921"/>
+        <w:gridCol w:w="1934"/>
         <w:gridCol w:w="1928"/>
       </w:tblGrid>
       <w:tr>
         <w:trPr/>
         <w:tc>
           <w:tcPr>
-            <w:tcW w:w="1923" w:type="dxa"/>
+            <w:tcW w:w="1921" w:type="dxa"/>
             <w:tcBorders>
               <w:top w:val="single" w:sz="4" w:space="0" w:color="000000"/>
               <w:start w:val="single" w:sz="4" w:space="0" w:color="000000"/>
@@ -76,7 +76,7 @@
         </w:tc>
         <w:tc>
           <w:tcPr>
-            <w:tcW w:w="1932" w:type="dxa"/>
+            <w:tcW w:w="1934" w:type="dxa"/>
             <w:tcBorders>
               <w:top w:val="single" w:sz="4" w:space="0" w:color="000000"/>
               <w:start w:val="single" w:sz="4" w:space="0" w:color="000000"/>
@@ -126,7 +126,7 @@
         </w:tc>
         <w:tc>
           <w:tcPr>
-            <w:tcW w:w="1923" w:type="dxa"/>
+            <w:tcW w:w="1921" w:type="dxa"/>
             <w:tcBorders>
               <w:top w:val="single" w:sz="4" w:space="0" w:color="000000"/>
               <w:start w:val="single" w:sz="4" w:space="0" w:color="000000"/>
@@ -176,7 +176,7 @@
         </w:tc>
         <w:tc>
           <w:tcPr>
-            <w:tcW w:w="1932" w:type="dxa"/>
+            <w:tcW w:w="1934" w:type="dxa"/>
             <w:tcBorders>
               <w:top w:val="single" w:sz="4" w:space="0" w:color="000000"/>
               <w:start w:val="single" w:sz="4" w:space="0" w:color="000000"/>
@@ -280,7 +280,7 @@
         <w:trPr/>
         <w:tc>
           <w:tcPr>
-            <w:tcW w:w="1923" w:type="dxa"/>
+            <w:tcW w:w="1921" w:type="dxa"/>
             <w:tcBorders>
               <w:start w:val="single" w:sz="4" w:space="0" w:color="000000"/>
               <w:bottom w:val="single" w:sz="4" w:space="0" w:color="000000"/>
@@ -329,7 +329,7 @@
         </w:tc>
         <w:tc>
           <w:tcPr>
-            <w:tcW w:w="1932" w:type="dxa"/>
+            <w:tcW w:w="1934" w:type="dxa"/>
             <w:tcBorders>
               <w:start w:val="single" w:sz="4" w:space="0" w:color="000000"/>
               <w:bottom w:val="single" w:sz="4" w:space="0" w:color="000000"/>
@@ -378,7 +378,7 @@
         </w:tc>
         <w:tc>
           <w:tcPr>
-            <w:tcW w:w="1923" w:type="dxa"/>
+            <w:tcW w:w="1921" w:type="dxa"/>
             <w:tcBorders>
               <w:start w:val="single" w:sz="4" w:space="0" w:color="000000"/>
               <w:bottom w:val="single" w:sz="4" w:space="0" w:color="000000"/>
@@ -427,7 +427,7 @@
         </w:tc>
         <w:tc>
           <w:tcPr>
-            <w:tcW w:w="1932" w:type="dxa"/>
+            <w:tcW w:w="1934" w:type="dxa"/>
             <w:tcBorders>
               <w:start w:val="single" w:sz="4" w:space="0" w:color="000000"/>
               <w:bottom w:val="single" w:sz="4" w:space="0" w:color="000000"/>
@@ -529,7 +529,7 @@
         <w:trPr/>
         <w:tc>
           <w:tcPr>
-            <w:tcW w:w="1923" w:type="dxa"/>
+            <w:tcW w:w="1921" w:type="dxa"/>
             <w:tcBorders>
               <w:start w:val="single" w:sz="4" w:space="0" w:color="000000"/>
               <w:bottom w:val="single" w:sz="4" w:space="0" w:color="000000"/>
@@ -578,7 +578,7 @@
         </w:tc>
         <w:tc>
           <w:tcPr>
-            <w:tcW w:w="1932" w:type="dxa"/>
+            <w:tcW w:w="1934" w:type="dxa"/>
             <w:tcBorders>
               <w:start w:val="single" w:sz="4" w:space="0" w:color="000000"/>
               <w:bottom w:val="single" w:sz="4" w:space="0" w:color="000000"/>
@@ -627,7 +627,7 @@
         </w:tc>
         <w:tc>
           <w:tcPr>
-            <w:tcW w:w="1923" w:type="dxa"/>
+            <w:tcW w:w="1921" w:type="dxa"/>
             <w:tcBorders>
               <w:start w:val="single" w:sz="4" w:space="0" w:color="000000"/>
               <w:bottom w:val="single" w:sz="4" w:space="0" w:color="000000"/>
@@ -676,7 +676,7 @@
         </w:tc>
         <w:tc>
           <w:tcPr>
-            <w:tcW w:w="1932" w:type="dxa"/>
+            <w:tcW w:w="1934" w:type="dxa"/>
             <w:tcBorders>
               <w:start w:val="single" w:sz="4" w:space="0" w:color="000000"/>
               <w:bottom w:val="single" w:sz="4" w:space="0" w:color="000000"/>
@@ -778,7 +778,7 @@
         <w:trPr/>
         <w:tc>
           <w:tcPr>
-            <w:tcW w:w="1923" w:type="dxa"/>
+            <w:tcW w:w="1921" w:type="dxa"/>
             <w:tcBorders>
               <w:start w:val="single" w:sz="4" w:space="0" w:color="000000"/>
               <w:bottom w:val="single" w:sz="4" w:space="0" w:color="000000"/>
@@ -827,7 +827,7 @@
         </w:tc>
         <w:tc>
           <w:tcPr>
-            <w:tcW w:w="1932" w:type="dxa"/>
+            <w:tcW w:w="1934" w:type="dxa"/>
             <w:tcBorders>
               <w:start w:val="single" w:sz="4" w:space="0" w:color="000000"/>
               <w:bottom w:val="single" w:sz="4" w:space="0" w:color="000000"/>
@@ -876,7 +876,7 @@
         </w:tc>
         <w:tc>
           <w:tcPr>
-            <w:tcW w:w="1923" w:type="dxa"/>
+            <w:tcW w:w="1921" w:type="dxa"/>
             <w:tcBorders>
               <w:start w:val="single" w:sz="4" w:space="0" w:color="000000"/>
               <w:bottom w:val="single" w:sz="4" w:space="0" w:color="000000"/>
@@ -925,7 +925,7 @@
         </w:tc>
         <w:tc>
           <w:tcPr>
-            <w:tcW w:w="1932" w:type="dxa"/>
+            <w:tcW w:w="1934" w:type="dxa"/>
             <w:tcBorders>
               <w:start w:val="single" w:sz="4" w:space="0" w:color="000000"/>
               <w:bottom w:val="single" w:sz="4" w:space="0" w:color="000000"/>
@@ -1027,7 +1027,7 @@
         <w:trPr/>
         <w:tc>
           <w:tcPr>
-            <w:tcW w:w="1923" w:type="dxa"/>
+            <w:tcW w:w="1921" w:type="dxa"/>
             <w:tcBorders>
               <w:start w:val="single" w:sz="4" w:space="0" w:color="000000"/>
               <w:bottom w:val="single" w:sz="4" w:space="0" w:color="000000"/>
@@ -1076,7 +1076,7 @@
         </w:tc>
         <w:tc>
           <w:tcPr>
-            <w:tcW w:w="1932" w:type="dxa"/>
+            <w:tcW w:w="1934" w:type="dxa"/>
             <w:tcBorders>
               <w:start w:val="single" w:sz="4" w:space="0" w:color="000000"/>
               <w:bottom w:val="single" w:sz="4" w:space="0" w:color="000000"/>
@@ -1125,7 +1125,7 @@
         </w:tc>
         <w:tc>
           <w:tcPr>
-            <w:tcW w:w="1923" w:type="dxa"/>
+            <w:tcW w:w="1921" w:type="dxa"/>
             <w:tcBorders>
               <w:start w:val="single" w:sz="4" w:space="0" w:color="000000"/>
               <w:bottom w:val="single" w:sz="4" w:space="0" w:color="000000"/>
@@ -1174,7 +1174,7 @@
         </w:tc>
         <w:tc>
           <w:tcPr>
-            <w:tcW w:w="1932" w:type="dxa"/>
+            <w:tcW w:w="1934" w:type="dxa"/>
             <w:tcBorders>
               <w:start w:val="single" w:sz="4" w:space="0" w:color="000000"/>
               <w:bottom w:val="single" w:sz="4" w:space="0" w:color="000000"/>
@@ -1276,7 +1276,7 @@
         <w:trPr/>
         <w:tc>
           <w:tcPr>
-            <w:tcW w:w="1923" w:type="dxa"/>
+            <w:tcW w:w="1921" w:type="dxa"/>
             <w:tcBorders>
               <w:start w:val="single" w:sz="4" w:space="0" w:color="000000"/>
               <w:bottom w:val="single" w:sz="4" w:space="0" w:color="000000"/>
@@ -1325,7 +1325,7 @@
         </w:tc>
         <w:tc>
           <w:tcPr>
-            <w:tcW w:w="1932" w:type="dxa"/>
+            <w:tcW w:w="1934" w:type="dxa"/>
             <w:tcBorders>
               <w:start w:val="single" w:sz="4" w:space="0" w:color="000000"/>
               <w:bottom w:val="single" w:sz="4" w:space="0" w:color="000000"/>
@@ -1374,7 +1374,7 @@
         </w:tc>
         <w:tc>
           <w:tcPr>
-            <w:tcW w:w="1923" w:type="dxa"/>
+            <w:tcW w:w="1921" w:type="dxa"/>
             <w:tcBorders>
               <w:start w:val="single" w:sz="4" w:space="0" w:color="000000"/>
               <w:bottom w:val="single" w:sz="4" w:space="0" w:color="000000"/>
@@ -1423,7 +1423,7 @@
         </w:tc>
         <w:tc>
           <w:tcPr>
-            <w:tcW w:w="1932" w:type="dxa"/>
+            <w:tcW w:w="1934" w:type="dxa"/>
             <w:tcBorders>
               <w:start w:val="single" w:sz="4" w:space="0" w:color="000000"/>
               <w:bottom w:val="single" w:sz="4" w:space="0" w:color="000000"/>
@@ -1531,6 +1531,18 @@
       </w:pPr>
       <w:r>
         <w:rPr/>
+      </w:r>
+    </w:p>
+    <w:p>
+      <w:pPr>
+        <w:pStyle w:val="Normal"/>
+        <w:bidi w:val="0"/>
+        <w:jc w:val="start"/>
+        <w:rPr/>
+      </w:pPr>
+      <w:r>
+        <w:rPr/>
+        <w:t>INTEGRATION TESTS</w:t>
       </w:r>
     </w:p>
     <w:p>
@@ -1853,6 +1865,124 @@
       <w:bookmarkEnd w:id="5"/>
       <w:bookmarkEnd w:id="6"/>
       <w:bookmarkEnd w:id="7"/>
+    </w:p>
+    <w:p>
+      <w:pPr>
+        <w:pStyle w:val="Normal"/>
+        <w:bidi w:val="0"/>
+        <w:jc w:val="start"/>
+        <w:rPr/>
+      </w:pPr>
+      <w:r>
+        <w:rPr/>
+      </w:r>
+    </w:p>
+    <w:p>
+      <w:pPr>
+        <w:pStyle w:val="Normal"/>
+        <w:bidi w:val="0"/>
+        <w:jc w:val="start"/>
+        <w:rPr/>
+      </w:pPr>
+      <w:r>
+        <w:rPr/>
+      </w:r>
+    </w:p>
+    <w:p>
+      <w:pPr>
+        <w:pStyle w:val="Normal"/>
+        <w:bidi w:val="0"/>
+        <w:jc w:val="start"/>
+        <w:rPr/>
+      </w:pPr>
+      <w:r>
+        <w:rPr/>
+        <w:t>DATABASE TESTS</w:t>
+      </w:r>
+    </w:p>
+    <w:p>
+      <w:pPr>
+        <w:pStyle w:val="Normal"/>
+        <w:bidi w:val="0"/>
+        <w:jc w:val="start"/>
+        <w:rPr/>
+      </w:pPr>
+      <w:r>
+        <w:rPr/>
+        <w:t>* Add another CHAIN named “Test Chain” with the following details (chain_date_created_at, chain_headquarters_address_room_no, chain_headquarters_address_building, chain_headquarters_address_street, chain_headquarters_address_city, chain_headquarters_address_admin_division, chain_headquarters_address_country, chain_headquarters_address_post_code) (Test Chain', '14, 'Test Building 2', 'Test Street 2', 'Test City Two', 'Test Division Twoo', 'India', '560001)</w:t>
+      </w:r>
+    </w:p>
+    <w:p>
+      <w:pPr>
+        <w:pStyle w:val="Normal"/>
+        <w:bidi w:val="0"/>
+        <w:jc w:val="start"/>
+        <w:rPr/>
+      </w:pPr>
+      <w:r>
+        <w:rPr/>
+        <w:t>* Change the chain_headquarters_address_room_no of “Test Chain” to NULL.</w:t>
+      </w:r>
+    </w:p>
+    <w:p>
+      <w:pPr>
+        <w:pStyle w:val="Normal"/>
+        <w:bidi w:val="0"/>
+        <w:jc w:val="start"/>
+        <w:rPr/>
+      </w:pPr>
+      <w:r>
+        <w:rPr/>
+        <w:t>* Change the chain_headquarters_address_room_no from NULL to “16”.</w:t>
+      </w:r>
+    </w:p>
+    <w:p>
+      <w:pPr>
+        <w:pStyle w:val="Normal"/>
+        <w:bidi w:val="0"/>
+        <w:jc w:val="start"/>
+        <w:rPr/>
+      </w:pPr>
+      <w:r>
+        <w:rPr/>
+        <w:t>* Change the chain_headquarters_address_building of “Test Chain” to NULL.</w:t>
+      </w:r>
+    </w:p>
+    <w:p>
+      <w:pPr>
+        <w:pStyle w:val="Normal"/>
+        <w:bidi w:val="0"/>
+        <w:jc w:val="start"/>
+        <w:rPr/>
+      </w:pPr>
+      <w:r>
+        <w:rPr/>
+        <w:t>* Change the chain_headquarters_address_building of “Test Chain” from NULL to “TEST BUILDING”.</w:t>
+      </w:r>
+    </w:p>
+    <w:p>
+      <w:pPr>
+        <w:pStyle w:val="Normal"/>
+        <w:bidi w:val="0"/>
+        <w:jc w:val="start"/>
+        <w:rPr/>
+      </w:pPr>
+      <w:r>
+        <w:rPr/>
+        <w:t>* Delete the CHAIN that has chain_id = 3.</w:t>
+      </w:r>
+    </w:p>
+    <w:p>
+      <w:pPr>
+        <w:pStyle w:val="Normal"/>
+        <w:bidi w:val="0"/>
+        <w:jc w:val="start"/>
+        <w:rPr/>
+      </w:pPr>
+      <w:r>
+        <w:rPr/>
+        <w:t>NOTE: “Test Chain” has chain_ id = 4.</w:t>
+      </w:r>
     </w:p>
     <w:sectPr>
       <w:type w:val="nextPage"/>

</xml_diff>

<commit_message>
Created outlet integration tests. ALL OUTLET INTEGRATION TESTS SUCCESSFULLY PASSED.
</commit_message>
<xml_diff>
--- a/Portal_Database_Design/Chain_APIs.docx
+++ b/Portal_Database_Design/Chain_APIs.docx
@@ -1907,18 +1907,22 @@
         <w:jc w:val="start"/>
         <w:rPr/>
       </w:pPr>
+      <w:bookmarkStart w:id="8" w:name="__DdeLink__138_2894387740"/>
       <w:r>
         <w:rPr/>
         <w:t>* Add another CHAIN named “Test Chain” with the following details (chain_date_created_at, chain_headquarters_address_room_no, chain_headquarters_address_building, chain_headquarters_address_street, chain_headquarters_address_city, chain_headquarters_address_admin_division, chain_headquarters_address_country, chain_headquarters_address_post_code) (Test Chain', '14, 'Test Building 2', 'Test Street 2', 'Test City Two', 'Test Division Twoo', 'India', '560001)</w:t>
       </w:r>
-    </w:p>
-    <w:p>
-      <w:pPr>
-        <w:pStyle w:val="Normal"/>
-        <w:bidi w:val="0"/>
-        <w:jc w:val="start"/>
-        <w:rPr/>
-      </w:pPr>
+      <w:bookmarkEnd w:id="8"/>
+    </w:p>
+    <w:p>
+      <w:pPr>
+        <w:pStyle w:val="Normal"/>
+        <w:bidi w:val="0"/>
+        <w:jc w:val="start"/>
+        <w:rPr/>
+      </w:pPr>
+      <w:bookmarkStart w:id="9" w:name="__DdeLink__136_2894387740"/>
+      <w:bookmarkStart w:id="10" w:name="__DdeLink__133_2894387740"/>
       <w:r>
         <w:rPr/>
         <w:t>* Change the chain_headquarters_address_room_no of “Test Chain” to NULL.</w:t>
@@ -1979,10 +1983,14 @@
         <w:jc w:val="start"/>
         <w:rPr/>
       </w:pPr>
+      <w:bookmarkStart w:id="11" w:name="__DdeLink__136_2894387740"/>
+      <w:bookmarkStart w:id="12" w:name="__DdeLink__133_2894387740"/>
       <w:r>
         <w:rPr/>
         <w:t>NOTE: “Test Chain” has chain_ id = 4.</w:t>
       </w:r>
+      <w:bookmarkEnd w:id="11"/>
+      <w:bookmarkEnd w:id="12"/>
     </w:p>
     <w:sectPr>
       <w:type w:val="nextPage"/>

</xml_diff>

<commit_message>
Added API Descriptions to Chain_APIs.docx, Post_APIs.docx and Outlets_APIs.docx.
</commit_message>
<xml_diff>
--- a/Portal_Database_Design/Chain_APIs.docx
+++ b/Portal_Database_Design/Chain_APIs.docx
@@ -16,8 +16,8 @@
         </w:tblCellMar>
       </w:tblPr>
       <w:tblGrid>
-        <w:gridCol w:w="1921"/>
-        <w:gridCol w:w="1934"/>
+        <w:gridCol w:w="1919"/>
+        <w:gridCol w:w="1936"/>
         <w:gridCol w:w="1921"/>
         <w:gridCol w:w="1934"/>
         <w:gridCol w:w="1928"/>
@@ -26,7 +26,7 @@
         <w:trPr/>
         <w:tc>
           <w:tcPr>
-            <w:tcW w:w="1921" w:type="dxa"/>
+            <w:tcW w:w="1919" w:type="dxa"/>
             <w:tcBorders>
               <w:top w:val="single" w:sz="4" w:space="0" w:color="000000"/>
               <w:start w:val="single" w:sz="4" w:space="0" w:color="000000"/>
@@ -76,7 +76,7 @@
         </w:tc>
         <w:tc>
           <w:tcPr>
-            <w:tcW w:w="1934" w:type="dxa"/>
+            <w:tcW w:w="1936" w:type="dxa"/>
             <w:tcBorders>
               <w:top w:val="single" w:sz="4" w:space="0" w:color="000000"/>
               <w:start w:val="single" w:sz="4" w:space="0" w:color="000000"/>
@@ -280,56 +280,73 @@
         <w:trPr/>
         <w:tc>
           <w:tcPr>
-            <w:tcW w:w="1921" w:type="dxa"/>
-            <w:tcBorders>
-              <w:start w:val="single" w:sz="4" w:space="0" w:color="000000"/>
-              <w:bottom w:val="single" w:sz="4" w:space="0" w:color="000000"/>
-            </w:tcBorders>
-          </w:tcPr>
-          <w:p>
-            <w:pPr>
-              <w:pStyle w:val="TableContents"/>
-              <w:bidi w:val="0"/>
-              <w:jc w:val="start"/>
-              <w:rPr>
-                <w:rFonts w:ascii="Liberation Serif" w:hAnsi="Liberation Serif"/>
-                <w:b w:val="false"/>
-                <w:bCs w:val="false"/>
-                <w:i w:val="false"/>
-                <w:i w:val="false"/>
-                <w:iCs w:val="false"/>
-                <w:strike w:val="false"/>
-                <w:dstrike w:val="false"/>
-                <w:outline w:val="false"/>
-                <w:shadow w:val="false"/>
-                <w:color w:val="000000"/>
-                <w:sz w:val="24"/>
-                <w:szCs w:val="24"/>
-                <w:u w:val="none"/>
-              </w:rPr>
-            </w:pPr>
-            <w:r>
-              <w:rPr>
-                <w:b w:val="false"/>
-                <w:bCs w:val="false"/>
-                <w:i w:val="false"/>
-                <w:iCs w:val="false"/>
-                <w:strike w:val="false"/>
-                <w:dstrike w:val="false"/>
-                <w:outline w:val="false"/>
-                <w:shadow w:val="false"/>
-                <w:color w:val="000000"/>
-                <w:sz w:val="24"/>
-                <w:szCs w:val="24"/>
-                <w:u w:val="none"/>
-              </w:rPr>
-              <w:t>CreateChain</w:t>
-            </w:r>
-          </w:p>
-        </w:tc>
-        <w:tc>
-          <w:tcPr>
-            <w:tcW w:w="1934" w:type="dxa"/>
+            <w:tcW w:w="1919" w:type="dxa"/>
+            <w:tcBorders>
+              <w:start w:val="single" w:sz="4" w:space="0" w:color="000000"/>
+              <w:bottom w:val="single" w:sz="4" w:space="0" w:color="000000"/>
+            </w:tcBorders>
+          </w:tcPr>
+          <w:p>
+            <w:pPr>
+              <w:pStyle w:val="TableContents"/>
+              <w:bidi w:val="0"/>
+              <w:jc w:val="start"/>
+              <w:rPr>
+                <w:rFonts w:ascii="Liberation Serif" w:hAnsi="Liberation Serif"/>
+                <w:b w:val="false"/>
+                <w:bCs w:val="false"/>
+                <w:i w:val="false"/>
+                <w:i w:val="false"/>
+                <w:iCs w:val="false"/>
+                <w:strike w:val="false"/>
+                <w:dstrike w:val="false"/>
+                <w:outline w:val="false"/>
+                <w:shadow w:val="false"/>
+                <w:color w:val="000000"/>
+                <w:sz w:val="24"/>
+                <w:szCs w:val="24"/>
+                <w:u w:val="none"/>
+              </w:rPr>
+            </w:pPr>
+            <w:r>
+              <w:rPr>
+                <w:b w:val="false"/>
+                <w:bCs w:val="false"/>
+                <w:i w:val="false"/>
+                <w:iCs w:val="false"/>
+                <w:strike w:val="false"/>
+                <w:dstrike w:val="false"/>
+                <w:outline w:val="false"/>
+                <w:shadow w:val="false"/>
+                <w:color w:val="000000"/>
+                <w:sz w:val="24"/>
+                <w:szCs w:val="24"/>
+                <w:u w:val="none"/>
+              </w:rPr>
+              <w:t>c</w:t>
+            </w:r>
+            <w:r>
+              <w:rPr>
+                <w:b w:val="false"/>
+                <w:bCs w:val="false"/>
+                <w:i w:val="false"/>
+                <w:iCs w:val="false"/>
+                <w:strike w:val="false"/>
+                <w:dstrike w:val="false"/>
+                <w:outline w:val="false"/>
+                <w:shadow w:val="false"/>
+                <w:color w:val="000000"/>
+                <w:sz w:val="24"/>
+                <w:szCs w:val="24"/>
+                <w:u w:val="none"/>
+              </w:rPr>
+              <w:t>reateChain</w:t>
+            </w:r>
+          </w:p>
+        </w:tc>
+        <w:tc>
+          <w:tcPr>
+            <w:tcW w:w="1936" w:type="dxa"/>
             <w:tcBorders>
               <w:start w:val="single" w:sz="4" w:space="0" w:color="000000"/>
               <w:bottom w:val="single" w:sz="4" w:space="0" w:color="000000"/>
@@ -529,56 +546,73 @@
         <w:trPr/>
         <w:tc>
           <w:tcPr>
-            <w:tcW w:w="1921" w:type="dxa"/>
-            <w:tcBorders>
-              <w:start w:val="single" w:sz="4" w:space="0" w:color="000000"/>
-              <w:bottom w:val="single" w:sz="4" w:space="0" w:color="000000"/>
-            </w:tcBorders>
-          </w:tcPr>
-          <w:p>
-            <w:pPr>
-              <w:pStyle w:val="TableContents"/>
-              <w:bidi w:val="0"/>
-              <w:jc w:val="start"/>
-              <w:rPr>
-                <w:rFonts w:ascii="Liberation Serif" w:hAnsi="Liberation Serif"/>
-                <w:b w:val="false"/>
-                <w:bCs w:val="false"/>
-                <w:i w:val="false"/>
-                <w:i w:val="false"/>
-                <w:iCs w:val="false"/>
-                <w:strike w:val="false"/>
-                <w:dstrike w:val="false"/>
-                <w:outline w:val="false"/>
-                <w:shadow w:val="false"/>
-                <w:color w:val="000000"/>
-                <w:sz w:val="24"/>
-                <w:szCs w:val="24"/>
-                <w:u w:val="none"/>
-              </w:rPr>
-            </w:pPr>
-            <w:r>
-              <w:rPr>
-                <w:b w:val="false"/>
-                <w:bCs w:val="false"/>
-                <w:i w:val="false"/>
-                <w:iCs w:val="false"/>
-                <w:strike w:val="false"/>
-                <w:dstrike w:val="false"/>
-                <w:outline w:val="false"/>
-                <w:shadow w:val="false"/>
-                <w:color w:val="000000"/>
-                <w:sz w:val="24"/>
-                <w:szCs w:val="24"/>
-                <w:u w:val="none"/>
-              </w:rPr>
-              <w:t>UpdateChainName</w:t>
-            </w:r>
-          </w:p>
-        </w:tc>
-        <w:tc>
-          <w:tcPr>
-            <w:tcW w:w="1934" w:type="dxa"/>
+            <w:tcW w:w="1919" w:type="dxa"/>
+            <w:tcBorders>
+              <w:start w:val="single" w:sz="4" w:space="0" w:color="000000"/>
+              <w:bottom w:val="single" w:sz="4" w:space="0" w:color="000000"/>
+            </w:tcBorders>
+          </w:tcPr>
+          <w:p>
+            <w:pPr>
+              <w:pStyle w:val="TableContents"/>
+              <w:bidi w:val="0"/>
+              <w:jc w:val="start"/>
+              <w:rPr>
+                <w:rFonts w:ascii="Liberation Serif" w:hAnsi="Liberation Serif"/>
+                <w:b w:val="false"/>
+                <w:bCs w:val="false"/>
+                <w:i w:val="false"/>
+                <w:i w:val="false"/>
+                <w:iCs w:val="false"/>
+                <w:strike w:val="false"/>
+                <w:dstrike w:val="false"/>
+                <w:outline w:val="false"/>
+                <w:shadow w:val="false"/>
+                <w:color w:val="000000"/>
+                <w:sz w:val="24"/>
+                <w:szCs w:val="24"/>
+                <w:u w:val="none"/>
+              </w:rPr>
+            </w:pPr>
+            <w:r>
+              <w:rPr>
+                <w:b w:val="false"/>
+                <w:bCs w:val="false"/>
+                <w:i w:val="false"/>
+                <w:iCs w:val="false"/>
+                <w:strike w:val="false"/>
+                <w:dstrike w:val="false"/>
+                <w:outline w:val="false"/>
+                <w:shadow w:val="false"/>
+                <w:color w:val="000000"/>
+                <w:sz w:val="24"/>
+                <w:szCs w:val="24"/>
+                <w:u w:val="none"/>
+              </w:rPr>
+              <w:t>u</w:t>
+            </w:r>
+            <w:r>
+              <w:rPr>
+                <w:b w:val="false"/>
+                <w:bCs w:val="false"/>
+                <w:i w:val="false"/>
+                <w:iCs w:val="false"/>
+                <w:strike w:val="false"/>
+                <w:dstrike w:val="false"/>
+                <w:outline w:val="false"/>
+                <w:shadow w:val="false"/>
+                <w:color w:val="000000"/>
+                <w:sz w:val="24"/>
+                <w:szCs w:val="24"/>
+                <w:u w:val="none"/>
+              </w:rPr>
+              <w:t>pdateChainName</w:t>
+            </w:r>
+          </w:p>
+        </w:tc>
+        <w:tc>
+          <w:tcPr>
+            <w:tcW w:w="1936" w:type="dxa"/>
             <w:tcBorders>
               <w:start w:val="single" w:sz="4" w:space="0" w:color="000000"/>
               <w:bottom w:val="single" w:sz="4" w:space="0" w:color="000000"/>
@@ -778,56 +812,73 @@
         <w:trPr/>
         <w:tc>
           <w:tcPr>
-            <w:tcW w:w="1921" w:type="dxa"/>
-            <w:tcBorders>
-              <w:start w:val="single" w:sz="4" w:space="0" w:color="000000"/>
-              <w:bottom w:val="single" w:sz="4" w:space="0" w:color="000000"/>
-            </w:tcBorders>
-          </w:tcPr>
-          <w:p>
-            <w:pPr>
-              <w:pStyle w:val="TableContents"/>
-              <w:bidi w:val="0"/>
-              <w:jc w:val="start"/>
-              <w:rPr>
-                <w:rFonts w:ascii="Liberation Serif" w:hAnsi="Liberation Serif"/>
-                <w:b w:val="false"/>
-                <w:bCs w:val="false"/>
-                <w:i w:val="false"/>
-                <w:i w:val="false"/>
-                <w:iCs w:val="false"/>
-                <w:strike w:val="false"/>
-                <w:dstrike w:val="false"/>
-                <w:outline w:val="false"/>
-                <w:shadow w:val="false"/>
-                <w:color w:val="000000"/>
-                <w:sz w:val="24"/>
-                <w:szCs w:val="24"/>
-                <w:u w:val="none"/>
-              </w:rPr>
-            </w:pPr>
-            <w:r>
-              <w:rPr>
-                <w:b w:val="false"/>
-                <w:bCs w:val="false"/>
-                <w:i w:val="false"/>
-                <w:iCs w:val="false"/>
-                <w:strike w:val="false"/>
-                <w:dstrike w:val="false"/>
-                <w:outline w:val="false"/>
-                <w:shadow w:val="false"/>
-                <w:color w:val="000000"/>
-                <w:sz w:val="24"/>
-                <w:szCs w:val="24"/>
-                <w:u w:val="none"/>
-              </w:rPr>
-              <w:t>UpdateChainAddress</w:t>
-            </w:r>
-          </w:p>
-        </w:tc>
-        <w:tc>
-          <w:tcPr>
-            <w:tcW w:w="1934" w:type="dxa"/>
+            <w:tcW w:w="1919" w:type="dxa"/>
+            <w:tcBorders>
+              <w:start w:val="single" w:sz="4" w:space="0" w:color="000000"/>
+              <w:bottom w:val="single" w:sz="4" w:space="0" w:color="000000"/>
+            </w:tcBorders>
+          </w:tcPr>
+          <w:p>
+            <w:pPr>
+              <w:pStyle w:val="TableContents"/>
+              <w:bidi w:val="0"/>
+              <w:jc w:val="start"/>
+              <w:rPr>
+                <w:rFonts w:ascii="Liberation Serif" w:hAnsi="Liberation Serif"/>
+                <w:b w:val="false"/>
+                <w:bCs w:val="false"/>
+                <w:i w:val="false"/>
+                <w:i w:val="false"/>
+                <w:iCs w:val="false"/>
+                <w:strike w:val="false"/>
+                <w:dstrike w:val="false"/>
+                <w:outline w:val="false"/>
+                <w:shadow w:val="false"/>
+                <w:color w:val="000000"/>
+                <w:sz w:val="24"/>
+                <w:szCs w:val="24"/>
+                <w:u w:val="none"/>
+              </w:rPr>
+            </w:pPr>
+            <w:r>
+              <w:rPr>
+                <w:b w:val="false"/>
+                <w:bCs w:val="false"/>
+                <w:i w:val="false"/>
+                <w:iCs w:val="false"/>
+                <w:strike w:val="false"/>
+                <w:dstrike w:val="false"/>
+                <w:outline w:val="false"/>
+                <w:shadow w:val="false"/>
+                <w:color w:val="000000"/>
+                <w:sz w:val="24"/>
+                <w:szCs w:val="24"/>
+                <w:u w:val="none"/>
+              </w:rPr>
+              <w:t>u</w:t>
+            </w:r>
+            <w:r>
+              <w:rPr>
+                <w:b w:val="false"/>
+                <w:bCs w:val="false"/>
+                <w:i w:val="false"/>
+                <w:iCs w:val="false"/>
+                <w:strike w:val="false"/>
+                <w:dstrike w:val="false"/>
+                <w:outline w:val="false"/>
+                <w:shadow w:val="false"/>
+                <w:color w:val="000000"/>
+                <w:sz w:val="24"/>
+                <w:szCs w:val="24"/>
+                <w:u w:val="none"/>
+              </w:rPr>
+              <w:t>pdateChainAddress</w:t>
+            </w:r>
+          </w:p>
+        </w:tc>
+        <w:tc>
+          <w:tcPr>
+            <w:tcW w:w="1936" w:type="dxa"/>
             <w:tcBorders>
               <w:start w:val="single" w:sz="4" w:space="0" w:color="000000"/>
               <w:bottom w:val="single" w:sz="4" w:space="0" w:color="000000"/>
@@ -1027,6 +1078,104 @@
         <w:trPr/>
         <w:tc>
           <w:tcPr>
+            <w:tcW w:w="1919" w:type="dxa"/>
+            <w:tcBorders>
+              <w:start w:val="single" w:sz="4" w:space="0" w:color="000000"/>
+              <w:bottom w:val="single" w:sz="4" w:space="0" w:color="000000"/>
+            </w:tcBorders>
+          </w:tcPr>
+          <w:p>
+            <w:pPr>
+              <w:pStyle w:val="TableContents"/>
+              <w:bidi w:val="0"/>
+              <w:jc w:val="start"/>
+              <w:rPr>
+                <w:rFonts w:ascii="Liberation Serif" w:hAnsi="Liberation Serif"/>
+                <w:b w:val="false"/>
+                <w:bCs w:val="false"/>
+                <w:i w:val="false"/>
+                <w:i w:val="false"/>
+                <w:iCs w:val="false"/>
+                <w:strike w:val="false"/>
+                <w:dstrike w:val="false"/>
+                <w:outline w:val="false"/>
+                <w:shadow w:val="false"/>
+                <w:color w:val="000000"/>
+                <w:sz w:val="24"/>
+                <w:szCs w:val="24"/>
+                <w:u w:val="none"/>
+              </w:rPr>
+            </w:pPr>
+            <w:r>
+              <w:rPr>
+                <w:b w:val="false"/>
+                <w:bCs w:val="false"/>
+                <w:i w:val="false"/>
+                <w:iCs w:val="false"/>
+                <w:strike w:val="false"/>
+                <w:dstrike w:val="false"/>
+                <w:outline w:val="false"/>
+                <w:shadow w:val="false"/>
+                <w:color w:val="000000"/>
+                <w:sz w:val="24"/>
+                <w:szCs w:val="24"/>
+                <w:u w:val="none"/>
+              </w:rPr>
+              <w:t>findOneChain</w:t>
+            </w:r>
+          </w:p>
+        </w:tc>
+        <w:tc>
+          <w:tcPr>
+            <w:tcW w:w="1936" w:type="dxa"/>
+            <w:tcBorders>
+              <w:start w:val="single" w:sz="4" w:space="0" w:color="000000"/>
+              <w:bottom w:val="single" w:sz="4" w:space="0" w:color="000000"/>
+            </w:tcBorders>
+          </w:tcPr>
+          <w:p>
+            <w:pPr>
+              <w:pStyle w:val="TableContents"/>
+              <w:bidi w:val="0"/>
+              <w:jc w:val="start"/>
+              <w:rPr>
+                <w:rFonts w:ascii="Liberation Serif" w:hAnsi="Liberation Serif"/>
+                <w:b w:val="false"/>
+                <w:bCs w:val="false"/>
+                <w:i w:val="false"/>
+                <w:i w:val="false"/>
+                <w:iCs w:val="false"/>
+                <w:strike w:val="false"/>
+                <w:dstrike w:val="false"/>
+                <w:outline w:val="false"/>
+                <w:shadow w:val="false"/>
+                <w:color w:val="000000"/>
+                <w:sz w:val="24"/>
+                <w:szCs w:val="24"/>
+                <w:u w:val="none"/>
+              </w:rPr>
+            </w:pPr>
+            <w:r>
+              <w:rPr>
+                <w:b w:val="false"/>
+                <w:bCs w:val="false"/>
+                <w:i w:val="false"/>
+                <w:iCs w:val="false"/>
+                <w:strike w:val="false"/>
+                <w:dstrike w:val="false"/>
+                <w:outline w:val="false"/>
+                <w:shadow w:val="false"/>
+                <w:color w:val="000000"/>
+                <w:sz w:val="24"/>
+                <w:szCs w:val="24"/>
+                <w:u w:val="none"/>
+              </w:rPr>
+              <w:t>Find a CHAIN</w:t>
+            </w:r>
+          </w:p>
+        </w:tc>
+        <w:tc>
+          <w:tcPr>
             <w:tcW w:w="1921" w:type="dxa"/>
             <w:tcBorders>
               <w:start w:val="single" w:sz="4" w:space="0" w:color="000000"/>
@@ -1070,7 +1219,7 @@
                 <w:szCs w:val="24"/>
                 <w:u w:val="none"/>
               </w:rPr>
-              <w:t>SearchChainsByName</w:t>
+              <w:t>NONE</w:t>
             </w:r>
           </w:p>
         </w:tc>
@@ -1119,105 +1268,7 @@
                 <w:szCs w:val="24"/>
                 <w:u w:val="none"/>
               </w:rPr>
-              <w:t>Search for a CHAIN by its chain_name.</w:t>
-            </w:r>
-          </w:p>
-        </w:tc>
-        <w:tc>
-          <w:tcPr>
-            <w:tcW w:w="1921" w:type="dxa"/>
-            <w:tcBorders>
-              <w:start w:val="single" w:sz="4" w:space="0" w:color="000000"/>
-              <w:bottom w:val="single" w:sz="4" w:space="0" w:color="000000"/>
-            </w:tcBorders>
-          </w:tcPr>
-          <w:p>
-            <w:pPr>
-              <w:pStyle w:val="TableContents"/>
-              <w:bidi w:val="0"/>
-              <w:jc w:val="start"/>
-              <w:rPr>
-                <w:rFonts w:ascii="Liberation Serif" w:hAnsi="Liberation Serif"/>
-                <w:b w:val="false"/>
-                <w:bCs w:val="false"/>
-                <w:i w:val="false"/>
-                <w:i w:val="false"/>
-                <w:iCs w:val="false"/>
-                <w:strike w:val="false"/>
-                <w:dstrike w:val="false"/>
-                <w:outline w:val="false"/>
-                <w:shadow w:val="false"/>
-                <w:color w:val="000000"/>
-                <w:sz w:val="24"/>
-                <w:szCs w:val="24"/>
-                <w:u w:val="none"/>
-              </w:rPr>
-            </w:pPr>
-            <w:r>
-              <w:rPr>
-                <w:b w:val="false"/>
-                <w:bCs w:val="false"/>
-                <w:i w:val="false"/>
-                <w:iCs w:val="false"/>
-                <w:strike w:val="false"/>
-                <w:dstrike w:val="false"/>
-                <w:outline w:val="false"/>
-                <w:shadow w:val="false"/>
-                <w:color w:val="000000"/>
-                <w:sz w:val="24"/>
-                <w:szCs w:val="24"/>
-                <w:u w:val="none"/>
-              </w:rPr>
-              <w:t>NONE</w:t>
-            </w:r>
-          </w:p>
-        </w:tc>
-        <w:tc>
-          <w:tcPr>
-            <w:tcW w:w="1934" w:type="dxa"/>
-            <w:tcBorders>
-              <w:start w:val="single" w:sz="4" w:space="0" w:color="000000"/>
-              <w:bottom w:val="single" w:sz="4" w:space="0" w:color="000000"/>
-            </w:tcBorders>
-          </w:tcPr>
-          <w:p>
-            <w:pPr>
-              <w:pStyle w:val="TableContents"/>
-              <w:bidi w:val="0"/>
-              <w:jc w:val="start"/>
-              <w:rPr>
-                <w:rFonts w:ascii="Liberation Serif" w:hAnsi="Liberation Serif"/>
-                <w:b w:val="false"/>
-                <w:bCs w:val="false"/>
-                <w:i w:val="false"/>
-                <w:i w:val="false"/>
-                <w:iCs w:val="false"/>
-                <w:strike w:val="false"/>
-                <w:dstrike w:val="false"/>
-                <w:outline w:val="false"/>
-                <w:shadow w:val="false"/>
-                <w:color w:val="000000"/>
-                <w:sz w:val="24"/>
-                <w:szCs w:val="24"/>
-                <w:u w:val="none"/>
-              </w:rPr>
-            </w:pPr>
-            <w:r>
-              <w:rPr>
-                <w:b w:val="false"/>
-                <w:bCs w:val="false"/>
-                <w:i w:val="false"/>
-                <w:iCs w:val="false"/>
-                <w:strike w:val="false"/>
-                <w:dstrike w:val="false"/>
-                <w:outline w:val="false"/>
-                <w:shadow w:val="false"/>
-                <w:color w:val="000000"/>
-                <w:sz w:val="24"/>
-                <w:szCs w:val="24"/>
-                <w:u w:val="none"/>
-              </w:rPr>
-              <w:t>chain_name</w:t>
+              <w:t>chain_id</w:t>
             </w:r>
           </w:p>
         </w:tc>
@@ -1267,7 +1318,7 @@
                 <w:szCs w:val="24"/>
                 <w:u w:val="none"/>
               </w:rPr>
-              <w:t>One or more CHAIN records.</w:t>
+              <w:t>CHAIN record.</w:t>
             </w:r>
           </w:p>
         </w:tc>
@@ -1276,6 +1327,104 @@
         <w:trPr/>
         <w:tc>
           <w:tcPr>
+            <w:tcW w:w="1919" w:type="dxa"/>
+            <w:tcBorders>
+              <w:start w:val="single" w:sz="4" w:space="0" w:color="000000"/>
+              <w:bottom w:val="single" w:sz="4" w:space="0" w:color="000000"/>
+            </w:tcBorders>
+          </w:tcPr>
+          <w:p>
+            <w:pPr>
+              <w:pStyle w:val="TableContents"/>
+              <w:bidi w:val="0"/>
+              <w:jc w:val="start"/>
+              <w:rPr>
+                <w:rFonts w:ascii="Liberation Serif" w:hAnsi="Liberation Serif"/>
+                <w:b w:val="false"/>
+                <w:bCs w:val="false"/>
+                <w:i w:val="false"/>
+                <w:i w:val="false"/>
+                <w:iCs w:val="false"/>
+                <w:strike w:val="false"/>
+                <w:dstrike w:val="false"/>
+                <w:outline w:val="false"/>
+                <w:shadow w:val="false"/>
+                <w:color w:val="000000"/>
+                <w:sz w:val="24"/>
+                <w:szCs w:val="24"/>
+                <w:u w:val="none"/>
+              </w:rPr>
+            </w:pPr>
+            <w:r>
+              <w:rPr>
+                <w:b w:val="false"/>
+                <w:bCs w:val="false"/>
+                <w:i w:val="false"/>
+                <w:iCs w:val="false"/>
+                <w:strike w:val="false"/>
+                <w:dstrike w:val="false"/>
+                <w:outline w:val="false"/>
+                <w:shadow w:val="false"/>
+                <w:color w:val="000000"/>
+                <w:sz w:val="24"/>
+                <w:szCs w:val="24"/>
+                <w:u w:val="none"/>
+              </w:rPr>
+              <w:t>findAllChains</w:t>
+            </w:r>
+          </w:p>
+        </w:tc>
+        <w:tc>
+          <w:tcPr>
+            <w:tcW w:w="1936" w:type="dxa"/>
+            <w:tcBorders>
+              <w:start w:val="single" w:sz="4" w:space="0" w:color="000000"/>
+              <w:bottom w:val="single" w:sz="4" w:space="0" w:color="000000"/>
+            </w:tcBorders>
+          </w:tcPr>
+          <w:p>
+            <w:pPr>
+              <w:pStyle w:val="TableContents"/>
+              <w:bidi w:val="0"/>
+              <w:jc w:val="start"/>
+              <w:rPr>
+                <w:rFonts w:ascii="Liberation Serif" w:hAnsi="Liberation Serif"/>
+                <w:b w:val="false"/>
+                <w:bCs w:val="false"/>
+                <w:i w:val="false"/>
+                <w:i w:val="false"/>
+                <w:iCs w:val="false"/>
+                <w:strike w:val="false"/>
+                <w:dstrike w:val="false"/>
+                <w:outline w:val="false"/>
+                <w:shadow w:val="false"/>
+                <w:color w:val="000000"/>
+                <w:sz w:val="24"/>
+                <w:szCs w:val="24"/>
+                <w:u w:val="none"/>
+              </w:rPr>
+            </w:pPr>
+            <w:r>
+              <w:rPr>
+                <w:b w:val="false"/>
+                <w:bCs w:val="false"/>
+                <w:i w:val="false"/>
+                <w:iCs w:val="false"/>
+                <w:strike w:val="false"/>
+                <w:dstrike w:val="false"/>
+                <w:outline w:val="false"/>
+                <w:shadow w:val="false"/>
+                <w:color w:val="000000"/>
+                <w:sz w:val="24"/>
+                <w:szCs w:val="24"/>
+                <w:u w:val="none"/>
+              </w:rPr>
+              <w:t>Find all CHAINs</w:t>
+            </w:r>
+          </w:p>
+        </w:tc>
+        <w:tc>
+          <w:tcPr>
             <w:tcW w:w="1921" w:type="dxa"/>
             <w:tcBorders>
               <w:start w:val="single" w:sz="4" w:space="0" w:color="000000"/>
@@ -1319,13 +1468,447 @@
                 <w:szCs w:val="24"/>
                 <w:u w:val="none"/>
               </w:rPr>
-              <w:t>DeleteChainByName</w:t>
+              <w:t>NONE</w:t>
             </w:r>
           </w:p>
         </w:tc>
         <w:tc>
           <w:tcPr>
             <w:tcW w:w="1934" w:type="dxa"/>
+            <w:tcBorders>
+              <w:start w:val="single" w:sz="4" w:space="0" w:color="000000"/>
+              <w:bottom w:val="single" w:sz="4" w:space="0" w:color="000000"/>
+            </w:tcBorders>
+          </w:tcPr>
+          <w:p>
+            <w:pPr>
+              <w:pStyle w:val="TableContents"/>
+              <w:bidi w:val="0"/>
+              <w:jc w:val="start"/>
+              <w:rPr>
+                <w:rFonts w:ascii="Liberation Serif" w:hAnsi="Liberation Serif"/>
+                <w:b w:val="false"/>
+                <w:bCs w:val="false"/>
+                <w:i w:val="false"/>
+                <w:i w:val="false"/>
+                <w:iCs w:val="false"/>
+                <w:strike w:val="false"/>
+                <w:dstrike w:val="false"/>
+                <w:outline w:val="false"/>
+                <w:shadow w:val="false"/>
+                <w:color w:val="000000"/>
+                <w:sz w:val="24"/>
+                <w:szCs w:val="24"/>
+                <w:u w:val="none"/>
+              </w:rPr>
+            </w:pPr>
+            <w:r>
+              <w:rPr>
+                <w:b w:val="false"/>
+                <w:bCs w:val="false"/>
+                <w:i w:val="false"/>
+                <w:iCs w:val="false"/>
+                <w:strike w:val="false"/>
+                <w:dstrike w:val="false"/>
+                <w:outline w:val="false"/>
+                <w:shadow w:val="false"/>
+                <w:color w:val="000000"/>
+                <w:sz w:val="24"/>
+                <w:szCs w:val="24"/>
+                <w:u w:val="none"/>
+              </w:rPr>
+              <w:t>NONE</w:t>
+            </w:r>
+          </w:p>
+        </w:tc>
+        <w:tc>
+          <w:tcPr>
+            <w:tcW w:w="1928" w:type="dxa"/>
+            <w:tcBorders>
+              <w:start w:val="single" w:sz="4" w:space="0" w:color="000000"/>
+              <w:bottom w:val="single" w:sz="4" w:space="0" w:color="000000"/>
+              <w:end w:val="single" w:sz="4" w:space="0" w:color="000000"/>
+            </w:tcBorders>
+          </w:tcPr>
+          <w:p>
+            <w:pPr>
+              <w:pStyle w:val="TableContents"/>
+              <w:bidi w:val="0"/>
+              <w:jc w:val="start"/>
+              <w:rPr>
+                <w:rFonts w:ascii="Liberation Serif" w:hAnsi="Liberation Serif"/>
+                <w:b w:val="false"/>
+                <w:bCs w:val="false"/>
+                <w:i w:val="false"/>
+                <w:i w:val="false"/>
+                <w:iCs w:val="false"/>
+                <w:strike w:val="false"/>
+                <w:dstrike w:val="false"/>
+                <w:outline w:val="false"/>
+                <w:shadow w:val="false"/>
+                <w:color w:val="000000"/>
+                <w:sz w:val="24"/>
+                <w:szCs w:val="24"/>
+                <w:u w:val="none"/>
+              </w:rPr>
+            </w:pPr>
+            <w:r>
+              <w:rPr>
+                <w:b w:val="false"/>
+                <w:bCs w:val="false"/>
+                <w:i w:val="false"/>
+                <w:iCs w:val="false"/>
+                <w:strike w:val="false"/>
+                <w:dstrike w:val="false"/>
+                <w:outline w:val="false"/>
+                <w:shadow w:val="false"/>
+                <w:color w:val="000000"/>
+                <w:sz w:val="24"/>
+                <w:szCs w:val="24"/>
+                <w:u w:val="none"/>
+              </w:rPr>
+              <w:t>All CHAIN records.</w:t>
+            </w:r>
+          </w:p>
+        </w:tc>
+      </w:tr>
+      <w:tr>
+        <w:trPr/>
+        <w:tc>
+          <w:tcPr>
+            <w:tcW w:w="1919" w:type="dxa"/>
+            <w:tcBorders>
+              <w:start w:val="single" w:sz="4" w:space="0" w:color="000000"/>
+              <w:bottom w:val="single" w:sz="4" w:space="0" w:color="000000"/>
+            </w:tcBorders>
+          </w:tcPr>
+          <w:p>
+            <w:pPr>
+              <w:pStyle w:val="TableContents"/>
+              <w:bidi w:val="0"/>
+              <w:jc w:val="start"/>
+              <w:rPr>
+                <w:rFonts w:ascii="Liberation Serif" w:hAnsi="Liberation Serif"/>
+                <w:b w:val="false"/>
+                <w:bCs w:val="false"/>
+                <w:i w:val="false"/>
+                <w:i w:val="false"/>
+                <w:iCs w:val="false"/>
+                <w:strike w:val="false"/>
+                <w:dstrike w:val="false"/>
+                <w:outline w:val="false"/>
+                <w:shadow w:val="false"/>
+                <w:color w:val="000000"/>
+                <w:sz w:val="24"/>
+                <w:szCs w:val="24"/>
+                <w:u w:val="none"/>
+              </w:rPr>
+            </w:pPr>
+            <w:r>
+              <w:rPr>
+                <w:b w:val="false"/>
+                <w:bCs w:val="false"/>
+                <w:i w:val="false"/>
+                <w:iCs w:val="false"/>
+                <w:strike w:val="false"/>
+                <w:dstrike w:val="false"/>
+                <w:outline w:val="false"/>
+                <w:shadow w:val="false"/>
+                <w:color w:val="000000"/>
+                <w:sz w:val="24"/>
+                <w:szCs w:val="24"/>
+                <w:u w:val="none"/>
+              </w:rPr>
+              <w:t>s</w:t>
+            </w:r>
+            <w:r>
+              <w:rPr>
+                <w:b w:val="false"/>
+                <w:bCs w:val="false"/>
+                <w:i w:val="false"/>
+                <w:iCs w:val="false"/>
+                <w:strike w:val="false"/>
+                <w:dstrike w:val="false"/>
+                <w:outline w:val="false"/>
+                <w:shadow w:val="false"/>
+                <w:color w:val="000000"/>
+                <w:sz w:val="24"/>
+                <w:szCs w:val="24"/>
+                <w:u w:val="none"/>
+              </w:rPr>
+              <w:t>earchChainsByName</w:t>
+            </w:r>
+          </w:p>
+        </w:tc>
+        <w:tc>
+          <w:tcPr>
+            <w:tcW w:w="1936" w:type="dxa"/>
+            <w:tcBorders>
+              <w:start w:val="single" w:sz="4" w:space="0" w:color="000000"/>
+              <w:bottom w:val="single" w:sz="4" w:space="0" w:color="000000"/>
+            </w:tcBorders>
+          </w:tcPr>
+          <w:p>
+            <w:pPr>
+              <w:pStyle w:val="TableContents"/>
+              <w:bidi w:val="0"/>
+              <w:jc w:val="start"/>
+              <w:rPr>
+                <w:rFonts w:ascii="Liberation Serif" w:hAnsi="Liberation Serif"/>
+                <w:b w:val="false"/>
+                <w:bCs w:val="false"/>
+                <w:i w:val="false"/>
+                <w:i w:val="false"/>
+                <w:iCs w:val="false"/>
+                <w:strike w:val="false"/>
+                <w:dstrike w:val="false"/>
+                <w:outline w:val="false"/>
+                <w:shadow w:val="false"/>
+                <w:color w:val="000000"/>
+                <w:sz w:val="24"/>
+                <w:szCs w:val="24"/>
+                <w:u w:val="none"/>
+              </w:rPr>
+            </w:pPr>
+            <w:r>
+              <w:rPr>
+                <w:b w:val="false"/>
+                <w:bCs w:val="false"/>
+                <w:i w:val="false"/>
+                <w:iCs w:val="false"/>
+                <w:strike w:val="false"/>
+                <w:dstrike w:val="false"/>
+                <w:outline w:val="false"/>
+                <w:shadow w:val="false"/>
+                <w:color w:val="000000"/>
+                <w:sz w:val="24"/>
+                <w:szCs w:val="24"/>
+                <w:u w:val="none"/>
+              </w:rPr>
+              <w:t>Search for a CHAIN by its chain_name.</w:t>
+            </w:r>
+          </w:p>
+        </w:tc>
+        <w:tc>
+          <w:tcPr>
+            <w:tcW w:w="1921" w:type="dxa"/>
+            <w:tcBorders>
+              <w:start w:val="single" w:sz="4" w:space="0" w:color="000000"/>
+              <w:bottom w:val="single" w:sz="4" w:space="0" w:color="000000"/>
+            </w:tcBorders>
+          </w:tcPr>
+          <w:p>
+            <w:pPr>
+              <w:pStyle w:val="TableContents"/>
+              <w:bidi w:val="0"/>
+              <w:jc w:val="start"/>
+              <w:rPr>
+                <w:rFonts w:ascii="Liberation Serif" w:hAnsi="Liberation Serif"/>
+                <w:b w:val="false"/>
+                <w:bCs w:val="false"/>
+                <w:i w:val="false"/>
+                <w:i w:val="false"/>
+                <w:iCs w:val="false"/>
+                <w:strike w:val="false"/>
+                <w:dstrike w:val="false"/>
+                <w:outline w:val="false"/>
+                <w:shadow w:val="false"/>
+                <w:color w:val="000000"/>
+                <w:sz w:val="24"/>
+                <w:szCs w:val="24"/>
+                <w:u w:val="none"/>
+              </w:rPr>
+            </w:pPr>
+            <w:r>
+              <w:rPr>
+                <w:b w:val="false"/>
+                <w:bCs w:val="false"/>
+                <w:i w:val="false"/>
+                <w:iCs w:val="false"/>
+                <w:strike w:val="false"/>
+                <w:dstrike w:val="false"/>
+                <w:outline w:val="false"/>
+                <w:shadow w:val="false"/>
+                <w:color w:val="000000"/>
+                <w:sz w:val="24"/>
+                <w:szCs w:val="24"/>
+                <w:u w:val="none"/>
+              </w:rPr>
+              <w:t>NONE</w:t>
+            </w:r>
+          </w:p>
+        </w:tc>
+        <w:tc>
+          <w:tcPr>
+            <w:tcW w:w="1934" w:type="dxa"/>
+            <w:tcBorders>
+              <w:start w:val="single" w:sz="4" w:space="0" w:color="000000"/>
+              <w:bottom w:val="single" w:sz="4" w:space="0" w:color="000000"/>
+            </w:tcBorders>
+          </w:tcPr>
+          <w:p>
+            <w:pPr>
+              <w:pStyle w:val="TableContents"/>
+              <w:bidi w:val="0"/>
+              <w:jc w:val="start"/>
+              <w:rPr>
+                <w:rFonts w:ascii="Liberation Serif" w:hAnsi="Liberation Serif"/>
+                <w:b w:val="false"/>
+                <w:bCs w:val="false"/>
+                <w:i w:val="false"/>
+                <w:i w:val="false"/>
+                <w:iCs w:val="false"/>
+                <w:strike w:val="false"/>
+                <w:dstrike w:val="false"/>
+                <w:outline w:val="false"/>
+                <w:shadow w:val="false"/>
+                <w:color w:val="000000"/>
+                <w:sz w:val="24"/>
+                <w:szCs w:val="24"/>
+                <w:u w:val="none"/>
+              </w:rPr>
+            </w:pPr>
+            <w:r>
+              <w:rPr>
+                <w:b w:val="false"/>
+                <w:bCs w:val="false"/>
+                <w:i w:val="false"/>
+                <w:iCs w:val="false"/>
+                <w:strike w:val="false"/>
+                <w:dstrike w:val="false"/>
+                <w:outline w:val="false"/>
+                <w:shadow w:val="false"/>
+                <w:color w:val="000000"/>
+                <w:sz w:val="24"/>
+                <w:szCs w:val="24"/>
+                <w:u w:val="none"/>
+              </w:rPr>
+              <w:t>chain_name</w:t>
+            </w:r>
+          </w:p>
+        </w:tc>
+        <w:tc>
+          <w:tcPr>
+            <w:tcW w:w="1928" w:type="dxa"/>
+            <w:tcBorders>
+              <w:start w:val="single" w:sz="4" w:space="0" w:color="000000"/>
+              <w:bottom w:val="single" w:sz="4" w:space="0" w:color="000000"/>
+              <w:end w:val="single" w:sz="4" w:space="0" w:color="000000"/>
+            </w:tcBorders>
+          </w:tcPr>
+          <w:p>
+            <w:pPr>
+              <w:pStyle w:val="TableContents"/>
+              <w:bidi w:val="0"/>
+              <w:jc w:val="start"/>
+              <w:rPr>
+                <w:rFonts w:ascii="Liberation Serif" w:hAnsi="Liberation Serif"/>
+                <w:b w:val="false"/>
+                <w:bCs w:val="false"/>
+                <w:i w:val="false"/>
+                <w:i w:val="false"/>
+                <w:iCs w:val="false"/>
+                <w:strike w:val="false"/>
+                <w:dstrike w:val="false"/>
+                <w:outline w:val="false"/>
+                <w:shadow w:val="false"/>
+                <w:color w:val="000000"/>
+                <w:sz w:val="24"/>
+                <w:szCs w:val="24"/>
+                <w:u w:val="none"/>
+              </w:rPr>
+            </w:pPr>
+            <w:r>
+              <w:rPr>
+                <w:b w:val="false"/>
+                <w:bCs w:val="false"/>
+                <w:i w:val="false"/>
+                <w:iCs w:val="false"/>
+                <w:strike w:val="false"/>
+                <w:dstrike w:val="false"/>
+                <w:outline w:val="false"/>
+                <w:shadow w:val="false"/>
+                <w:color w:val="000000"/>
+                <w:sz w:val="24"/>
+                <w:szCs w:val="24"/>
+                <w:u w:val="none"/>
+              </w:rPr>
+              <w:t>One or more CHAIN records.</w:t>
+            </w:r>
+          </w:p>
+        </w:tc>
+      </w:tr>
+      <w:tr>
+        <w:trPr/>
+        <w:tc>
+          <w:tcPr>
+            <w:tcW w:w="1919" w:type="dxa"/>
+            <w:tcBorders>
+              <w:start w:val="single" w:sz="4" w:space="0" w:color="000000"/>
+              <w:bottom w:val="single" w:sz="4" w:space="0" w:color="000000"/>
+            </w:tcBorders>
+          </w:tcPr>
+          <w:p>
+            <w:pPr>
+              <w:pStyle w:val="TableContents"/>
+              <w:bidi w:val="0"/>
+              <w:jc w:val="start"/>
+              <w:rPr>
+                <w:rFonts w:ascii="Liberation Serif" w:hAnsi="Liberation Serif"/>
+                <w:b w:val="false"/>
+                <w:bCs w:val="false"/>
+                <w:i w:val="false"/>
+                <w:i w:val="false"/>
+                <w:iCs w:val="false"/>
+                <w:strike w:val="false"/>
+                <w:dstrike w:val="false"/>
+                <w:outline w:val="false"/>
+                <w:shadow w:val="false"/>
+                <w:color w:val="000000"/>
+                <w:sz w:val="24"/>
+                <w:szCs w:val="24"/>
+                <w:u w:val="none"/>
+              </w:rPr>
+            </w:pPr>
+            <w:r>
+              <w:rPr>
+                <w:b w:val="false"/>
+                <w:bCs w:val="false"/>
+                <w:i w:val="false"/>
+                <w:iCs w:val="false"/>
+                <w:strike w:val="false"/>
+                <w:dstrike w:val="false"/>
+                <w:outline w:val="false"/>
+                <w:shadow w:val="false"/>
+                <w:color w:val="000000"/>
+                <w:sz w:val="24"/>
+                <w:szCs w:val="24"/>
+                <w:u w:val="none"/>
+              </w:rPr>
+              <w:t>d</w:t>
+            </w:r>
+            <w:r>
+              <w:rPr>
+                <w:b w:val="false"/>
+                <w:bCs w:val="false"/>
+                <w:i w:val="false"/>
+                <w:iCs w:val="false"/>
+                <w:strike w:val="false"/>
+                <w:dstrike w:val="false"/>
+                <w:outline w:val="false"/>
+                <w:shadow w:val="false"/>
+                <w:color w:val="000000"/>
+                <w:sz w:val="24"/>
+                <w:szCs w:val="24"/>
+                <w:u w:val="none"/>
+              </w:rPr>
+              <w:t>eleteChainByName</w:t>
+            </w:r>
+          </w:p>
+        </w:tc>
+        <w:tc>
+          <w:tcPr>
+            <w:tcW w:w="1936" w:type="dxa"/>
             <w:tcBorders>
               <w:start w:val="single" w:sz="4" w:space="0" w:color="000000"/>
               <w:bottom w:val="single" w:sz="4" w:space="0" w:color="000000"/>
@@ -1537,11 +2120,408 @@
       <w:pPr>
         <w:pStyle w:val="Normal"/>
         <w:bidi w:val="0"/>
-        <w:jc w:val="start"/>
-        <w:rPr/>
-      </w:pPr>
-      <w:r>
-        <w:rPr/>
+        <w:jc w:val="center"/>
+        <w:rPr>
+          <w:b/>
+          <w:bCs/>
+        </w:rPr>
+      </w:pPr>
+      <w:r>
+        <w:rPr>
+          <w:b/>
+          <w:bCs/>
+        </w:rPr>
+        <w:t>API DESCRIPTIONS</w:t>
+      </w:r>
+    </w:p>
+    <w:p>
+      <w:pPr>
+        <w:pStyle w:val="Normal"/>
+        <w:bidi w:val="0"/>
+        <w:jc w:val="both"/>
+        <w:rPr>
+          <w:b w:val="false"/>
+          <w:bCs w:val="false"/>
+        </w:rPr>
+      </w:pPr>
+      <w:r>
+        <w:rPr>
+          <w:b w:val="false"/>
+          <w:bCs w:val="false"/>
+        </w:rPr>
+        <w:t>createChain -&gt; Takes all the details of a CHAIN record from the front-end [chain_related and chain_address related.] and creates a CHAIN record.</w:t>
+      </w:r>
+    </w:p>
+    <w:p>
+      <w:pPr>
+        <w:pStyle w:val="Normal"/>
+        <w:bidi w:val="0"/>
+        <w:jc w:val="both"/>
+        <w:rPr>
+          <w:b w:val="false"/>
+          <w:bCs w:val="false"/>
+        </w:rPr>
+      </w:pPr>
+      <w:r>
+        <w:rPr>
+          <w:b w:val="false"/>
+          <w:bCs w:val="false"/>
+        </w:rPr>
+      </w:r>
+    </w:p>
+    <w:p>
+      <w:pPr>
+        <w:pStyle w:val="Normal"/>
+        <w:bidi w:val="0"/>
+        <w:jc w:val="both"/>
+        <w:rPr>
+          <w:b w:val="false"/>
+          <w:bCs w:val="false"/>
+        </w:rPr>
+      </w:pPr>
+      <w:r>
+        <w:rPr>
+          <w:b w:val="false"/>
+          <w:bCs w:val="false"/>
+        </w:rPr>
+        <w:t>updateChainName -&gt; Takes the chain_name from the DTO, the chain_id from the URL param, both from the front-end and updates the chain_name of the respective CHAIN record.</w:t>
+      </w:r>
+    </w:p>
+    <w:p>
+      <w:pPr>
+        <w:pStyle w:val="Normal"/>
+        <w:bidi w:val="0"/>
+        <w:jc w:val="both"/>
+        <w:rPr>
+          <w:b w:val="false"/>
+          <w:bCs w:val="false"/>
+        </w:rPr>
+      </w:pPr>
+      <w:r>
+        <w:rPr>
+          <w:b w:val="false"/>
+          <w:bCs w:val="false"/>
+        </w:rPr>
+      </w:r>
+    </w:p>
+    <w:p>
+      <w:pPr>
+        <w:pStyle w:val="Normal"/>
+        <w:bidi w:val="0"/>
+        <w:jc w:val="both"/>
+        <w:rPr>
+          <w:b w:val="false"/>
+          <w:bCs w:val="false"/>
+        </w:rPr>
+      </w:pPr>
+      <w:r>
+        <w:rPr>
+          <w:b w:val="false"/>
+          <w:bCs w:val="false"/>
+        </w:rPr>
+        <w:t>updateChainAddress -&gt; Takes the chain_address_* related fields from the DTO, the chain_id from the URL param from the front-end and updates the chain_address_* related fields of the respective CHAIN record.</w:t>
+      </w:r>
+    </w:p>
+    <w:p>
+      <w:pPr>
+        <w:pStyle w:val="Normal"/>
+        <w:bidi w:val="0"/>
+        <w:jc w:val="both"/>
+        <w:rPr>
+          <w:b w:val="false"/>
+          <w:bCs w:val="false"/>
+        </w:rPr>
+      </w:pPr>
+      <w:r>
+        <w:rPr>
+          <w:b w:val="false"/>
+          <w:bCs w:val="false"/>
+        </w:rPr>
+      </w:r>
+    </w:p>
+    <w:p>
+      <w:pPr>
+        <w:pStyle w:val="Normal"/>
+        <w:bidi w:val="0"/>
+        <w:jc w:val="both"/>
+        <w:rPr>
+          <w:b w:val="false"/>
+          <w:bCs w:val="false"/>
+        </w:rPr>
+      </w:pPr>
+      <w:bookmarkStart w:id="0" w:name="__DdeLink__149_588342144"/>
+      <w:r>
+        <w:rPr>
+          <w:b w:val="false"/>
+          <w:bCs w:val="false"/>
+        </w:rPr>
+        <w:t xml:space="preserve">findOneChain -&gt; Takes the </w:t>
+      </w:r>
+      <w:bookmarkStart w:id="1" w:name="__DdeLink__443_1184157458"/>
+      <w:r>
+        <w:rPr>
+          <w:b w:val="false"/>
+          <w:bCs w:val="false"/>
+        </w:rPr>
+        <w:t>chain_id from the URL parameter from the front-end</w:t>
+      </w:r>
+      <w:bookmarkEnd w:id="1"/>
+      <w:r>
+        <w:rPr>
+          <w:b w:val="false"/>
+          <w:bCs w:val="false"/>
+        </w:rPr>
+        <w:t xml:space="preserve"> and returns the respective CHAIN record.</w:t>
+      </w:r>
+      <w:bookmarkEnd w:id="0"/>
+    </w:p>
+    <w:p>
+      <w:pPr>
+        <w:pStyle w:val="Normal"/>
+        <w:bidi w:val="0"/>
+        <w:jc w:val="both"/>
+        <w:rPr>
+          <w:b w:val="false"/>
+          <w:bCs w:val="false"/>
+        </w:rPr>
+      </w:pPr>
+      <w:r>
+        <w:rPr>
+          <w:b w:val="false"/>
+          <w:bCs w:val="false"/>
+        </w:rPr>
+      </w:r>
+    </w:p>
+    <w:p>
+      <w:pPr>
+        <w:pStyle w:val="Normal"/>
+        <w:bidi w:val="0"/>
+        <w:jc w:val="both"/>
+        <w:rPr>
+          <w:b w:val="false"/>
+          <w:bCs w:val="false"/>
+        </w:rPr>
+      </w:pPr>
+      <w:r>
+        <w:rPr>
+          <w:b w:val="false"/>
+          <w:bCs w:val="false"/>
+        </w:rPr>
+        <w:t>findAllChains -&gt; Takes no input from the front-end and returns all CHAIN records.</w:t>
+      </w:r>
+    </w:p>
+    <w:p>
+      <w:pPr>
+        <w:pStyle w:val="Normal"/>
+        <w:bidi w:val="0"/>
+        <w:jc w:val="both"/>
+        <w:rPr>
+          <w:b w:val="false"/>
+          <w:bCs w:val="false"/>
+        </w:rPr>
+      </w:pPr>
+      <w:r>
+        <w:rPr/>
+      </w:r>
+    </w:p>
+    <w:p>
+      <w:pPr>
+        <w:pStyle w:val="Normal"/>
+        <w:bidi w:val="0"/>
+        <w:jc w:val="both"/>
+        <w:rPr>
+          <w:b w:val="false"/>
+          <w:bCs w:val="false"/>
+        </w:rPr>
+      </w:pPr>
+      <w:r>
+        <w:rPr>
+          <w:b w:val="false"/>
+          <w:bCs w:val="false"/>
+        </w:rPr>
+        <w:t>removeChain  -&gt; Takes the   chain_id from the URL parameter from the front-end, deletes the respective CHAIN record and returns the deleted CHAIN record.</w:t>
+      </w:r>
+    </w:p>
+    <w:p>
+      <w:pPr>
+        <w:pStyle w:val="Normal"/>
+        <w:bidi w:val="0"/>
+        <w:jc w:val="center"/>
+        <w:rPr/>
+      </w:pPr>
+      <w:r>
+        <w:rPr/>
+      </w:r>
+    </w:p>
+    <w:p>
+      <w:pPr>
+        <w:pStyle w:val="Normal"/>
+        <w:bidi w:val="0"/>
+        <w:jc w:val="center"/>
+        <w:rPr/>
+      </w:pPr>
+      <w:r>
+        <w:rPr/>
+      </w:r>
+    </w:p>
+    <w:p>
+      <w:pPr>
+        <w:pStyle w:val="Normal"/>
+        <w:bidi w:val="0"/>
+        <w:jc w:val="center"/>
+        <w:rPr/>
+      </w:pPr>
+      <w:r>
+        <w:rPr/>
+      </w:r>
+    </w:p>
+    <w:p>
+      <w:pPr>
+        <w:pStyle w:val="Normal"/>
+        <w:bidi w:val="0"/>
+        <w:jc w:val="center"/>
+        <w:rPr/>
+      </w:pPr>
+      <w:r>
+        <w:rPr/>
+      </w:r>
+    </w:p>
+    <w:p>
+      <w:pPr>
+        <w:pStyle w:val="Normal"/>
+        <w:bidi w:val="0"/>
+        <w:jc w:val="center"/>
+        <w:rPr/>
+      </w:pPr>
+      <w:r>
+        <w:rPr/>
+      </w:r>
+    </w:p>
+    <w:p>
+      <w:pPr>
+        <w:pStyle w:val="Normal"/>
+        <w:bidi w:val="0"/>
+        <w:jc w:val="center"/>
+        <w:rPr/>
+      </w:pPr>
+      <w:r>
+        <w:rPr/>
+      </w:r>
+    </w:p>
+    <w:p>
+      <w:pPr>
+        <w:pStyle w:val="Normal"/>
+        <w:bidi w:val="0"/>
+        <w:jc w:val="center"/>
+        <w:rPr/>
+      </w:pPr>
+      <w:r>
+        <w:rPr/>
+      </w:r>
+    </w:p>
+    <w:p>
+      <w:pPr>
+        <w:pStyle w:val="Normal"/>
+        <w:bidi w:val="0"/>
+        <w:jc w:val="center"/>
+        <w:rPr/>
+      </w:pPr>
+      <w:r>
+        <w:rPr/>
+      </w:r>
+    </w:p>
+    <w:p>
+      <w:pPr>
+        <w:pStyle w:val="Normal"/>
+        <w:bidi w:val="0"/>
+        <w:jc w:val="center"/>
+        <w:rPr/>
+      </w:pPr>
+      <w:r>
+        <w:rPr/>
+      </w:r>
+    </w:p>
+    <w:p>
+      <w:pPr>
+        <w:pStyle w:val="Normal"/>
+        <w:bidi w:val="0"/>
+        <w:jc w:val="center"/>
+        <w:rPr/>
+      </w:pPr>
+      <w:r>
+        <w:rPr/>
+      </w:r>
+    </w:p>
+    <w:p>
+      <w:pPr>
+        <w:pStyle w:val="Normal"/>
+        <w:bidi w:val="0"/>
+        <w:jc w:val="center"/>
+        <w:rPr/>
+      </w:pPr>
+      <w:r>
+        <w:rPr/>
+      </w:r>
+    </w:p>
+    <w:p>
+      <w:pPr>
+        <w:pStyle w:val="Normal"/>
+        <w:bidi w:val="0"/>
+        <w:jc w:val="center"/>
+        <w:rPr/>
+      </w:pPr>
+      <w:r>
+        <w:rPr/>
+      </w:r>
+    </w:p>
+    <w:p>
+      <w:pPr>
+        <w:pStyle w:val="Normal"/>
+        <w:bidi w:val="0"/>
+        <w:jc w:val="center"/>
+        <w:rPr/>
+      </w:pPr>
+      <w:r>
+        <w:rPr/>
+      </w:r>
+    </w:p>
+    <w:p>
+      <w:pPr>
+        <w:pStyle w:val="Normal"/>
+        <w:bidi w:val="0"/>
+        <w:jc w:val="center"/>
+        <w:rPr/>
+      </w:pPr>
+      <w:r>
+        <w:rPr/>
+      </w:r>
+    </w:p>
+    <w:p>
+      <w:pPr>
+        <w:pStyle w:val="Normal"/>
+        <w:bidi w:val="0"/>
+        <w:jc w:val="center"/>
+        <w:rPr/>
+      </w:pPr>
+      <w:r>
+        <w:rPr/>
+      </w:r>
+    </w:p>
+    <w:p>
+      <w:pPr>
+        <w:pStyle w:val="Normal"/>
+        <w:bidi w:val="0"/>
+        <w:jc w:val="center"/>
+        <w:rPr>
+          <w:b/>
+          <w:bCs/>
+        </w:rPr>
+      </w:pPr>
+      <w:r>
+        <w:rPr>
+          <w:b/>
+          <w:bCs/>
+        </w:rPr>
         <w:t>INTEGRATION TESTS</w:t>
       </w:r>
     </w:p>
@@ -1600,12 +2580,12 @@
         <w:jc w:val="start"/>
         <w:rPr/>
       </w:pPr>
-      <w:bookmarkStart w:id="0" w:name="__DdeLink__92_3803631280"/>
+      <w:bookmarkStart w:id="2" w:name="__DdeLink__92_3803631280"/>
       <w:r>
         <w:rPr/>
         <w:t>* Create a CHAIN tuple without the chain_headquarters_address_city.</w:t>
       </w:r>
-      <w:bookmarkEnd w:id="0"/>
+      <w:bookmarkEnd w:id="2"/>
     </w:p>
     <w:p>
       <w:pPr>
@@ -1708,12 +2688,12 @@
         <w:jc w:val="start"/>
         <w:rPr/>
       </w:pPr>
-      <w:bookmarkStart w:id="1" w:name="__DdeLink__100_3803631280"/>
+      <w:bookmarkStart w:id="3" w:name="__DdeLink__100_3803631280"/>
       <w:r>
         <w:rPr/>
         <w:t>For UpdateChainAddress, the following tests:</w:t>
       </w:r>
-      <w:bookmarkEnd w:id="1"/>
+      <w:bookmarkEnd w:id="3"/>
     </w:p>
     <w:p>
       <w:pPr>
@@ -1734,12 +2714,12 @@
         <w:jc w:val="start"/>
         <w:rPr/>
       </w:pPr>
-      <w:bookmarkStart w:id="2" w:name="__DdeLink__94_3803631280"/>
+      <w:bookmarkStart w:id="4" w:name="__DdeLink__94_3803631280"/>
       <w:r>
         <w:rPr/>
         <w:t>* Update the CHAIN’s chain_headquarters_address_city.</w:t>
       </w:r>
-      <w:bookmarkEnd w:id="2"/>
+      <w:bookmarkEnd w:id="4"/>
     </w:p>
     <w:p>
       <w:pPr>
@@ -1752,12 +2732,12 @@
         <w:rPr/>
         <w:t xml:space="preserve">* </w:t>
       </w:r>
-      <w:bookmarkStart w:id="3" w:name="__DdeLink__96_3803631280"/>
+      <w:bookmarkStart w:id="5" w:name="__DdeLink__96_3803631280"/>
       <w:r>
         <w:rPr/>
         <w:t>Update the CHAIN’s chain_headquarters_address_street</w:t>
       </w:r>
-      <w:bookmarkEnd w:id="3"/>
+      <w:bookmarkEnd w:id="5"/>
       <w:r>
         <w:rPr/>
         <w:t>.</w:t>
@@ -1770,12 +2750,12 @@
         <w:jc w:val="start"/>
         <w:rPr/>
       </w:pPr>
-      <w:bookmarkStart w:id="4" w:name="__DdeLink__98_3803631280"/>
+      <w:bookmarkStart w:id="6" w:name="__DdeLink__98_3803631280"/>
       <w:r>
         <w:rPr/>
         <w:t>* Update the CHAIN’s chain_headquarters_address_country.</w:t>
       </w:r>
-      <w:bookmarkEnd w:id="4"/>
+      <w:bookmarkEnd w:id="6"/>
     </w:p>
     <w:p>
       <w:pPr>
@@ -1855,48 +2835,54 @@
         <w:jc w:val="start"/>
         <w:rPr/>
       </w:pPr>
-      <w:bookmarkStart w:id="5" w:name="__DdeLink__139_2312781727"/>
-      <w:bookmarkStart w:id="6" w:name="__DdeLink__142_2312781727"/>
-      <w:bookmarkStart w:id="7" w:name="__DdeLink__296_1992960000"/>
+      <w:bookmarkStart w:id="7" w:name="__DdeLink__139_2312781727"/>
+      <w:bookmarkStart w:id="8" w:name="__DdeLink__142_2312781727"/>
+      <w:bookmarkStart w:id="9" w:name="__DdeLink__296_1992960000"/>
       <w:r>
         <w:rPr/>
         <w:t>* Delete the CHAIN with chain_id 12.</w:t>
       </w:r>
-      <w:bookmarkEnd w:id="5"/>
-      <w:bookmarkEnd w:id="6"/>
       <w:bookmarkEnd w:id="7"/>
-    </w:p>
-    <w:p>
-      <w:pPr>
-        <w:pStyle w:val="Normal"/>
-        <w:bidi w:val="0"/>
-        <w:jc w:val="start"/>
-        <w:rPr/>
-      </w:pPr>
-      <w:r>
-        <w:rPr/>
-      </w:r>
-    </w:p>
-    <w:p>
-      <w:pPr>
-        <w:pStyle w:val="Normal"/>
-        <w:bidi w:val="0"/>
-        <w:jc w:val="start"/>
-        <w:rPr/>
-      </w:pPr>
-      <w:r>
-        <w:rPr/>
-      </w:r>
-    </w:p>
-    <w:p>
-      <w:pPr>
-        <w:pStyle w:val="Normal"/>
-        <w:bidi w:val="0"/>
-        <w:jc w:val="start"/>
-        <w:rPr/>
-      </w:pPr>
-      <w:r>
-        <w:rPr/>
+      <w:bookmarkEnd w:id="8"/>
+      <w:bookmarkEnd w:id="9"/>
+    </w:p>
+    <w:p>
+      <w:pPr>
+        <w:pStyle w:val="Normal"/>
+        <w:bidi w:val="0"/>
+        <w:jc w:val="start"/>
+        <w:rPr/>
+      </w:pPr>
+      <w:r>
+        <w:rPr/>
+      </w:r>
+    </w:p>
+    <w:p>
+      <w:pPr>
+        <w:pStyle w:val="Normal"/>
+        <w:bidi w:val="0"/>
+        <w:jc w:val="start"/>
+        <w:rPr/>
+      </w:pPr>
+      <w:r>
+        <w:rPr/>
+      </w:r>
+    </w:p>
+    <w:p>
+      <w:pPr>
+        <w:pStyle w:val="Normal"/>
+        <w:bidi w:val="0"/>
+        <w:jc w:val="center"/>
+        <w:rPr>
+          <w:b/>
+          <w:bCs/>
+        </w:rPr>
+      </w:pPr>
+      <w:r>
+        <w:rPr>
+          <w:b/>
+          <w:bCs/>
+        </w:rPr>
         <w:t>DATABASE TESTS</w:t>
       </w:r>
     </w:p>
@@ -1907,22 +2893,20 @@
         <w:jc w:val="start"/>
         <w:rPr/>
       </w:pPr>
-      <w:bookmarkStart w:id="8" w:name="__DdeLink__138_2894387740"/>
+      <w:bookmarkStart w:id="10" w:name="__DdeLink__138_2894387740"/>
       <w:r>
         <w:rPr/>
         <w:t>* Add another CHAIN named “Test Chain” with the following details (chain_date_created_at, chain_headquarters_address_room_no, chain_headquarters_address_building, chain_headquarters_address_street, chain_headquarters_address_city, chain_headquarters_address_admin_division, chain_headquarters_address_country, chain_headquarters_address_post_code) (Test Chain', '14, 'Test Building 2', 'Test Street 2', 'Test City Two', 'Test Division Twoo', 'India', '560001)</w:t>
       </w:r>
-      <w:bookmarkEnd w:id="8"/>
-    </w:p>
-    <w:p>
-      <w:pPr>
-        <w:pStyle w:val="Normal"/>
-        <w:bidi w:val="0"/>
-        <w:jc w:val="start"/>
-        <w:rPr/>
-      </w:pPr>
-      <w:bookmarkStart w:id="9" w:name="__DdeLink__136_2894387740"/>
-      <w:bookmarkStart w:id="10" w:name="__DdeLink__133_2894387740"/>
+      <w:bookmarkEnd w:id="10"/>
+    </w:p>
+    <w:p>
+      <w:pPr>
+        <w:pStyle w:val="Normal"/>
+        <w:bidi w:val="0"/>
+        <w:jc w:val="start"/>
+        <w:rPr/>
+      </w:pPr>
       <w:r>
         <w:rPr/>
         <w:t>* Change the chain_headquarters_address_room_no of “Test Chain” to NULL.</w:t>

</xml_diff>